<commit_message>
Expand Paper One and add CFP docs
Substantially revises `PAPER-ONE-antagonist-read-only.md` with new framing around Sloponomics, context rot/separation of context, expanded coaching economics, clearer section references, and additional references/limits language. Adds a CFP-ready proposal package, a review punch-list, a Paper Two concept stub, and supporting assets (`figure-2-context-rot.png` plus updated/new `.docx` exports).
</commit_message>
<xml_diff>
--- a/structureview/docs/PAPER-ONE-antagonist-read-only.docx
+++ b/structureview/docs/PAPER-ONE-antagonist-read-only.docx
@@ -191,13 +191,88 @@
         <w:t xml:space="preserve"> </w:t>
       </w:r>
       <w:r>
-        <w:t xml:space="preserve">gating it — provided the enforcer coaches continuously (shift-left) rather than blocking</w:t>
-      </w:r>
-      <w:r>
-        <w:t xml:space="preserve"> </w:t>
-      </w:r>
-      <w:r>
-        <w:t xml:space="preserve">once at commit. The empirical case is a single, self-inflicted, fully-instrumented n=1:</w:t>
+        <w:t xml:space="preserve">gating it — provided the enforcer coaches continuously to collapse feedback delay rather</w:t>
+      </w:r>
+      <w:r>
+        <w:t xml:space="preserve"> </w:t>
+      </w:r>
+      <w:r>
+        <w:t xml:space="preserve">than blocking once at commit. Against the claim that AI makes this unnecessary by making change</w:t>
+      </w:r>
+      <w:r>
+        <w:t xml:space="preserve"> </w:t>
+      </w:r>
+      <w:r>
+        <w:t xml:space="preserve">cheap, I introduce</w:t>
+      </w:r>
+      <w:r>
+        <w:t xml:space="preserve"> </w:t>
+      </w:r>
+      <w:r>
+        <w:rPr>
+          <w:b/>
+        </w:rPr>
+        <w:t xml:space="preserve">Sloponomics</w:t>
+      </w:r>
+      <w:r>
+        <w:t xml:space="preserve"> </w:t>
+      </w:r>
+      <w:r>
+        <w:t xml:space="preserve">— the economics of output that is cheap to emit and expensive</w:t>
+      </w:r>
+      <w:r>
+        <w:t xml:space="preserve"> </w:t>
+      </w:r>
+      <w:r>
+        <w:t xml:space="preserve">to own — and show that code-churn data bear it out: AI lowers the cost of</w:t>
+      </w:r>
+      <w:r>
+        <w:t xml:space="preserve"> </w:t>
+      </w:r>
+      <w:r>
+        <w:rPr>
+          <w:i/>
+        </w:rPr>
+        <w:t xml:space="preserve">emitting</w:t>
+      </w:r>
+      <w:r>
+        <w:t xml:space="preserve"> </w:t>
+      </w:r>
+      <w:r>
+        <w:t xml:space="preserve">code while</w:t>
+      </w:r>
+      <w:r>
+        <w:t xml:space="preserve"> </w:t>
+      </w:r>
+      <w:r>
+        <w:t xml:space="preserve">raising the cost of</w:t>
+      </w:r>
+      <w:r>
+        <w:t xml:space="preserve"> </w:t>
+      </w:r>
+      <w:r>
+        <w:rPr>
+          <w:i/>
+        </w:rPr>
+        <w:t xml:space="preserve">owning</w:t>
+      </w:r>
+      <w:r>
+        <w:t xml:space="preserve"> </w:t>
+      </w:r>
+      <w:r>
+        <w:t xml:space="preserve">it, and in regulated domains the deferred cost of ungoverned output</w:t>
+      </w:r>
+      <w:r>
+        <w:t xml:space="preserve"> </w:t>
+      </w:r>
+      <w:r>
+        <w:t xml:space="preserve">is a recordkeeping fine, not a flat line — so a cheap-emission world needs a read-only referee</w:t>
+      </w:r>
+      <w:r>
+        <w:t xml:space="preserve"> </w:t>
+      </w:r>
+      <w:r>
+        <w:t xml:space="preserve">more, not less. The empirical case is a single, self-inflicted, fully-instrumented n=1:</w:t>
       </w:r>
       <w:r>
         <w:t xml:space="preserve"> </w:t>
@@ -432,13 +507,13 @@
         <w:t xml:space="preserve"> </w:t>
       </w:r>
       <w:r>
-        <w:t xml:space="preserve">access corrupts a quality function (§2), then the incident that proves it does (§3), then a</w:t>
-      </w:r>
-      <w:r>
-        <w:t xml:space="preserve"> </w:t>
-      </w:r>
-      <w:r>
-        <w:t xml:space="preserve">control-theoretic model of when the corruption is inevitable (§4), then the reason read-only</w:t>
+        <w:t xml:space="preserve">access corrupts a quality function (Section 2), then the incident that proves it does (Section 3), then a</w:t>
+      </w:r>
+      <w:r>
+        <w:t xml:space="preserve"> </w:t>
+      </w:r>
+      <w:r>
+        <w:t xml:space="preserve">control-theoretic model of when the corruption is inevitable (Section 4), then the reason read-only</w:t>
       </w:r>
       <w:r>
         <w:t xml:space="preserve"> </w:t>
@@ -459,13 +534,13 @@
         <w:t xml:space="preserve"> </w:t>
       </w:r>
       <w:r>
-        <w:t xml:space="preserve">quality and not merely block it (§5), and finally the</w:t>
-      </w:r>
-      <w:r>
-        <w:t xml:space="preserve"> </w:t>
-      </w:r>
-      <w:r>
-        <w:t xml:space="preserve">limits of a single case (§6).</w:t>
+        <w:t xml:space="preserve">quality and not merely block it (Section 5), and finally the</w:t>
+      </w:r>
+      <w:r>
+        <w:t xml:space="preserve"> </w:t>
+      </w:r>
+      <w:r>
+        <w:t xml:space="preserve">limits of a single case (Section 6).</w:t>
       </w:r>
     </w:p>
     <w:p>
@@ -1682,7 +1757,7 @@
         <w:pStyle w:val="BodyText"/>
       </w:pPr>
       <w:r>
-        <w:t xml:space="preserve">The incident in §3 is what happens when the balancing loop’s</w:t>
+        <w:t xml:space="preserve">The incident in Section 3 is what happens when the balancing loop’s</w:t>
       </w:r>
       <w:r>
         <w:t xml:space="preserve"> </w:t>
@@ -1771,7 +1846,7 @@
         <w:pStyle w:val="BodyText"/>
       </w:pPr>
       <w:r>
-        <w:t xml:space="preserve">This yields the paper’s control-theoretic claim, stronger than the mechanism in §2 because</w:t>
+        <w:t xml:space="preserve">This yields the paper’s control-theoretic claim, stronger than the mechanism in Section 2 because</w:t>
       </w:r>
       <w:r>
         <w:t xml:space="preserve"> </w:t>
@@ -1896,6 +1971,510 @@
       </w:r>
       <w:r>
         <w:t xml:space="preserve">a critique it is permitted to overrule at the source.</w:t>
+      </w:r>
+    </w:p>
+    <w:p>
+      <w:pPr>
+        <w:pStyle w:val="Heading3"/>
+      </w:pPr>
+      <w:bookmarkStart w:id="28" w:name="Xa5863c194ed7b4f162bceea3db963e5e865c3bf"/>
+      <w:r>
+        <w:t xml:space="preserve">4.1 Context rot — separation of powers becomes separation of context</w:t>
+      </w:r>
+      <w:bookmarkEnd w:id="28"/>
+    </w:p>
+    <w:p>
+      <w:pPr>
+        <w:pStyle w:val="FirstParagraph"/>
+      </w:pPr>
+      <w:r>
+        <w:t xml:space="preserve">There is a second, independent reason the Builder cannot be its own referee, and it has</w:t>
+      </w:r>
+      <w:r>
+        <w:t xml:space="preserve"> </w:t>
+      </w:r>
+      <w:r>
+        <w:t xml:space="preserve">nothing to do with write access or incentive. It is a capability decay, and it gets worse</w:t>
+      </w:r>
+      <w:r>
+        <w:t xml:space="preserve"> </w:t>
+      </w:r>
+      <w:r>
+        <w:t xml:space="preserve">exactly when it matters most.</w:t>
+      </w:r>
+    </w:p>
+    <w:p>
+      <w:pPr>
+        <w:pStyle w:val="BodyText"/>
+      </w:pPr>
+      <w:r>
+        <w:t xml:space="preserve">Every current model degrades as its input grows. Chroma Research’s</w:t>
+      </w:r>
+      <w:r>
+        <w:t xml:space="preserve"> </w:t>
+      </w:r>
+      <w:r>
+        <w:rPr>
+          <w:i/>
+        </w:rPr>
+        <w:t xml:space="preserve">Context Rot</w:t>
+      </w:r>
+      <w:r>
+        <w:t xml:space="preserve"> </w:t>
+      </w:r>
+      <w:r>
+        <w:t xml:space="preserve">study (2025)</w:t>
+      </w:r>
+      <w:r>
+        <w:t xml:space="preserve"> </w:t>
+      </w:r>
+      <w:r>
+        <w:t xml:space="preserve">evaluated eighteen frontier models and found all eighteen become less reliable as context</w:t>
+      </w:r>
+      <w:r>
+        <w:t xml:space="preserve"> </w:t>
+      </w:r>
+      <w:r>
+        <w:t xml:space="preserve">lengthens — not only on hard reasoning but on simple retrieval and text-replication tasks, and</w:t>
+      </w:r>
+      <w:r>
+        <w:t xml:space="preserve"> </w:t>
+      </w:r>
+      <w:r>
+        <w:t xml:space="preserve">not gracefully: a model with a 200,000-token window can show significant degradation by around</w:t>
+      </w:r>
+      <w:r>
+        <w:t xml:space="preserve"> </w:t>
+      </w:r>
+      <w:r>
+        <w:t xml:space="preserve">50,000 tokens (</w:t>
+      </w:r>
+      <w:r>
+        <w:rPr>
+          <w:b/>
+        </w:rPr>
+        <w:t xml:space="preserve">Figure 2</w:t>
+      </w:r>
+      <w:r>
+        <w:t xml:space="preserve">). The nominal window is not the usable window. Roughly the first</w:t>
+      </w:r>
+      <w:r>
+        <w:t xml:space="preserve"> </w:t>
+      </w:r>
+      <w:r>
+        <w:t xml:space="preserve">quarter is trustworthy; past that the context is</w:t>
+      </w:r>
+      <w:r>
+        <w:t xml:space="preserve"> </w:t>
+      </w:r>
+      <w:r>
+        <w:rPr>
+          <w:i/>
+        </w:rPr>
+        <w:t xml:space="preserve">present but not reliably attended to</w:t>
+      </w:r>
+      <w:r>
+        <w:t xml:space="preserve"> </w:t>
+      </w:r>
+      <w:r>
+        <w:t xml:space="preserve">— the</w:t>
+      </w:r>
+      <w:r>
+        <w:t xml:space="preserve"> </w:t>
+      </w:r>
+      <w:r>
+        <w:t xml:space="preserve">tokens are in the window, but the model is no longer reading them evenly. This is why practical</w:t>
+      </w:r>
+      <w:r>
+        <w:t xml:space="preserve"> </w:t>
+      </w:r>
+      <w:r>
+        <w:t xml:space="preserve">context engineering is a discipline of</w:t>
+      </w:r>
+      <w:r>
+        <w:t xml:space="preserve"> </w:t>
+      </w:r>
+      <w:r>
+        <w:rPr>
+          <w:i/>
+        </w:rPr>
+        <w:t xml:space="preserve">subtraction</w:t>
+      </w:r>
+      <w:r>
+        <w:t xml:space="preserve">, not accumulation.</w:t>
+      </w:r>
+    </w:p>
+    <w:p>
+      <w:pPr>
+        <w:pStyle w:val="CaptionedFigure"/>
+      </w:pPr>
+      <w:r>
+        <w:drawing>
+          <wp:inline>
+            <wp:extent cx="5334000" cy="3137647"/>
+            <wp:effectExtent b="0" l="0" r="0" t="0"/>
+            <wp:docPr descr="Figure 2 — Context rot: task reliability decays well before the nominal window is “full.” Schematic, after Chroma Research, Context Rot (2025); all eighteen models tested degrade with input length." title="" id="1" name="Picture"/>
+            <a:graphic>
+              <a:graphicData uri="http://schemas.openxmlformats.org/drawingml/2006/picture">
+                <pic:pic>
+                  <pic:nvPicPr>
+                    <pic:cNvPr descr="./figure-2-context-rot.png" id="0" name="Picture"/>
+                    <pic:cNvPicPr>
+                      <a:picLocks noChangeArrowheads="1" noChangeAspect="1"/>
+                    </pic:cNvPicPr>
+                  </pic:nvPicPr>
+                  <pic:blipFill>
+                    <a:blip r:embed="rId29"/>
+                    <a:stretch>
+                      <a:fillRect/>
+                    </a:stretch>
+                  </pic:blipFill>
+                  <pic:spPr bwMode="auto">
+                    <a:xfrm>
+                      <a:off x="0" y="0"/>
+                      <a:ext cx="5334000" cy="3137647"/>
+                    </a:xfrm>
+                    <a:prstGeom prst="rect">
+                      <a:avLst/>
+                    </a:prstGeom>
+                    <a:noFill/>
+                    <a:ln w="9525">
+                      <a:noFill/>
+                      <a:headEnd/>
+                      <a:tailEnd/>
+                    </a:ln>
+                  </pic:spPr>
+                </pic:pic>
+              </a:graphicData>
+            </a:graphic>
+          </wp:inline>
+        </w:drawing>
+      </w:r>
+    </w:p>
+    <w:p>
+      <w:pPr>
+        <w:pStyle w:val="ImageCaption"/>
+      </w:pPr>
+      <w:r>
+        <w:t xml:space="preserve">Figure 2 — Context rot: task reliability decays well before the nominal window is</w:t>
+      </w:r>
+      <w:r>
+        <w:t xml:space="preserve"> </w:t>
+      </w:r>
+      <w:r>
+        <w:t xml:space="preserve">“</w:t>
+      </w:r>
+      <w:r>
+        <w:t xml:space="preserve">full.</w:t>
+      </w:r>
+      <w:r>
+        <w:t xml:space="preserve">”</w:t>
+      </w:r>
+      <w:r>
+        <w:t xml:space="preserve"> </w:t>
+      </w:r>
+      <w:r>
+        <w:t xml:space="preserve">Schematic, after Chroma Research,</w:t>
+      </w:r>
+      <w:r>
+        <w:t xml:space="preserve"> </w:t>
+      </w:r>
+      <w:r>
+        <w:rPr>
+          <w:i/>
+        </w:rPr>
+        <w:t xml:space="preserve">Context Rot</w:t>
+      </w:r>
+      <w:r>
+        <w:t xml:space="preserve"> </w:t>
+      </w:r>
+      <w:r>
+        <w:t xml:space="preserve">(2025); all eighteen models tested degrade with input length.</w:t>
+      </w:r>
+    </w:p>
+    <w:p>
+      <w:pPr>
+        <w:pStyle w:val="BodyText"/>
+      </w:pPr>
+      <w:r>
+        <w:rPr>
+          <w:b/>
+        </w:rPr>
+        <w:t xml:space="preserve">Figure 2.</w:t>
+      </w:r>
+      <w:r>
+        <w:t xml:space="preserve"> </w:t>
+      </w:r>
+      <w:r>
+        <w:rPr>
+          <w:i/>
+        </w:rPr>
+        <w:t xml:space="preserve">Context rot</w:t>
+      </w:r>
+      <w:r>
+        <w:t xml:space="preserve"> </w:t>
+      </w:r>
+      <w:r>
+        <w:t xml:space="preserve">(schematic, after Chroma 2025). The exact curves are illustrative;</w:t>
+      </w:r>
+      <w:r>
+        <w:t xml:space="preserve"> </w:t>
+      </w:r>
+      <w:r>
+        <w:t xml:space="preserve">the finding they illustrate is not — every model tested degrades with input length, and a</w:t>
+      </w:r>
+      <w:r>
+        <w:t xml:space="preserve"> </w:t>
+      </w:r>
+      <w:r>
+        <w:t xml:space="preserve">200K-window model can be materially unreliable at a quarter of that. The practical consequence</w:t>
+      </w:r>
+      <w:r>
+        <w:t xml:space="preserve"> </w:t>
+      </w:r>
+      <w:r>
+        <w:t xml:space="preserve">for an agent is the worst possible ordering: a Builder deep in a long task carries its</w:t>
+      </w:r>
+      <w:r>
+        <w:t xml:space="preserve"> </w:t>
+      </w:r>
+      <w:r>
+        <w:rPr>
+          <w:i/>
+        </w:rPr>
+        <w:t xml:space="preserve">most</w:t>
+      </w:r>
+      <w:r>
+        <w:rPr>
+          <w:i/>
+        </w:rPr>
+        <w:t xml:space="preserve"> </w:t>
+      </w:r>
+      <w:r>
+        <w:rPr>
+          <w:i/>
+        </w:rPr>
+        <w:t xml:space="preserve">rotted</w:t>
+      </w:r>
+      <w:r>
+        <w:t xml:space="preserve"> </w:t>
+      </w:r>
+      <w:r>
+        <w:t xml:space="preserve">context at the exact moment the accumulated code is largest and hardest to review. Its</w:t>
+      </w:r>
+      <w:r>
+        <w:t xml:space="preserve"> </w:t>
+      </w:r>
+      <w:r>
+        <w:t xml:space="preserve">capacity to self-check is lowest precisely when there is most to check. This matches what a long</w:t>
+      </w:r>
+      <w:r>
+        <w:t xml:space="preserve"> </w:t>
+      </w:r>
+      <w:r>
+        <w:t xml:space="preserve">agentic run actually looks like from the outside — an agent that was careful early quietly</w:t>
+      </w:r>
+      <w:r>
+        <w:t xml:space="preserve"> </w:t>
+      </w:r>
+      <w:r>
+        <w:t xml:space="preserve">cutting corners late, or abandoning a task seven-eighths of the way through an audit, not from</w:t>
+      </w:r>
+      <w:r>
+        <w:t xml:space="preserve"> </w:t>
+      </w:r>
+      <w:r>
+        <w:t xml:space="preserve">laziness but because the standard it was holding at token 5,000 has faded by token 90,000.</w:t>
+      </w:r>
+    </w:p>
+    <w:p>
+      <w:pPr>
+        <w:pStyle w:val="BodyText"/>
+      </w:pPr>
+      <w:r>
+        <w:t xml:space="preserve">This compounds Section 3 rather than competing with it. Ship-pressure supplies the</w:t>
+      </w:r>
+      <w:r>
+        <w:t xml:space="preserve"> </w:t>
+      </w:r>
+      <w:r>
+        <w:rPr>
+          <w:i/>
+        </w:rPr>
+        <w:t xml:space="preserve">motive</w:t>
+      </w:r>
+      <w:r>
+        <w:t xml:space="preserve"> </w:t>
+      </w:r>
+      <w:r>
+        <w:t xml:space="preserve">to cut the</w:t>
+      </w:r>
+      <w:r>
+        <w:t xml:space="preserve"> </w:t>
+      </w:r>
+      <w:r>
+        <w:t xml:space="preserve">corner; context rot supplies the</w:t>
+      </w:r>
+      <w:r>
+        <w:t xml:space="preserve"> </w:t>
+      </w:r>
+      <w:r>
+        <w:rPr>
+          <w:i/>
+        </w:rPr>
+        <w:t xml:space="preserve">decay in the faculty that would have caught it.</w:t>
+      </w:r>
+      <w:r>
+        <w:t xml:space="preserve"> </w:t>
+      </w:r>
+      <w:r>
+        <w:t xml:space="preserve">Incentive and</w:t>
+      </w:r>
+      <w:r>
+        <w:t xml:space="preserve"> </w:t>
+      </w:r>
+      <w:r>
+        <w:t xml:space="preserve">capability fail in the same direction at the same time. An enforcer folded into the Builder</w:t>
+      </w:r>
+      <w:r>
+        <w:t xml:space="preserve"> </w:t>
+      </w:r>
+      <w:r>
+        <w:t xml:space="preserve">inherits both failures: it is under the same clock</w:t>
+      </w:r>
+      <w:r>
+        <w:t xml:space="preserve"> </w:t>
+      </w:r>
+      <w:r>
+        <w:rPr>
+          <w:i/>
+        </w:rPr>
+        <w:t xml:space="preserve">and</w:t>
+      </w:r>
+      <w:r>
+        <w:t xml:space="preserve"> </w:t>
+      </w:r>
+      <w:r>
+        <w:t xml:space="preserve">running in the same rotted window, so</w:t>
+      </w:r>
+      <w:r>
+        <w:t xml:space="preserve"> </w:t>
+      </w:r>
+      <w:r>
+        <w:t xml:space="preserve">even a well-intentioned, read-only self-review is least trustworthy at the end of the job, which</w:t>
+      </w:r>
+      <w:r>
+        <w:t xml:space="preserve"> </w:t>
+      </w:r>
+      <w:r>
+        <w:t xml:space="preserve">is the only place a commit-time self-review happens.</w:t>
+      </w:r>
+    </w:p>
+    <w:p>
+      <w:pPr>
+        <w:pStyle w:val="BodyText"/>
+      </w:pPr>
+      <w:r>
+        <w:t xml:space="preserve">The fix extends the paper’s thesis one step. Separation of powers said the referee must not hold</w:t>
+      </w:r>
+      <w:r>
+        <w:t xml:space="preserve"> </w:t>
+      </w:r>
+      <w:r>
+        <w:t xml:space="preserve">the Builder’s</w:t>
+      </w:r>
+      <w:r>
+        <w:t xml:space="preserve"> </w:t>
+      </w:r>
+      <w:r>
+        <w:rPr>
+          <w:i/>
+        </w:rPr>
+        <w:t xml:space="preserve">pen</w:t>
+      </w:r>
+      <w:r>
+        <w:t xml:space="preserve">; context rot says the referee must not inherit the Builder’s</w:t>
+      </w:r>
+      <w:r>
+        <w:t xml:space="preserve"> </w:t>
+      </w:r>
+      <w:r>
+        <w:rPr>
+          <w:i/>
+        </w:rPr>
+        <w:t xml:space="preserve">window</w:t>
+      </w:r>
+      <w:r>
+        <w:t xml:space="preserve">. Call</w:t>
+      </w:r>
+      <w:r>
+        <w:t xml:space="preserve"> </w:t>
+      </w:r>
+      <w:r>
+        <w:t xml:space="preserve">it</w:t>
+      </w:r>
+      <w:r>
+        <w:t xml:space="preserve"> </w:t>
+      </w:r>
+      <w:r>
+        <w:rPr>
+          <w:b/>
+        </w:rPr>
+        <w:t xml:space="preserve">separation of context</w:t>
+      </w:r>
+      <w:r>
+        <w:t xml:space="preserve">: the Antagonist runs as a distinct session with a short, fresh</w:t>
+      </w:r>
+      <w:r>
+        <w:t xml:space="preserve"> </w:t>
+      </w:r>
+      <w:r>
+        <w:t xml:space="preserve">input — the artifact under review plus the fixed constitution — not the Builder’s kilotoken</w:t>
+      </w:r>
+      <w:r>
+        <w:t xml:space="preserve"> </w:t>
+      </w:r>
+      <w:r>
+        <w:t xml:space="preserve">transcript. It reads a bounded thing against a fixed standard and stays, permanently, in the</w:t>
+      </w:r>
+      <w:r>
+        <w:t xml:space="preserve"> </w:t>
+      </w:r>
+      <w:r>
+        <w:t xml:space="preserve">green zone of Figure 2, while the Builder’s window fills and rots. Read-only is what keeps the</w:t>
+      </w:r>
+      <w:r>
+        <w:t xml:space="preserve"> </w:t>
+      </w:r>
+      <w:r>
+        <w:t xml:space="preserve">standard unwritable; separate-context is what keeps the</w:t>
+      </w:r>
+      <w:r>
+        <w:t xml:space="preserve"> </w:t>
+      </w:r>
+      <w:r>
+        <w:rPr>
+          <w:i/>
+        </w:rPr>
+        <w:t xml:space="preserve">judgment</w:t>
+      </w:r>
+      <w:r>
+        <w:t xml:space="preserve"> </w:t>
+      </w:r>
+      <w:r>
+        <w:t xml:space="preserve">uncorrupted. They are the same</w:t>
+      </w:r>
+      <w:r>
+        <w:t xml:space="preserve"> </w:t>
+      </w:r>
+      <w:r>
+        <w:t xml:space="preserve">design instinct — the referee is constituted differently from the player — applied once to</w:t>
+      </w:r>
+      <w:r>
+        <w:t xml:space="preserve"> </w:t>
+      </w:r>
+      <w:r>
+        <w:t xml:space="preserve">authority and once to attention.</w:t>
       </w:r>
     </w:p>
     <w:p>
@@ -1909,11 +2488,11 @@
       <w:pPr>
         <w:pStyle w:val="Heading2"/>
       </w:pPr>
-      <w:bookmarkStart w:id="28" w:name="Xea04b7eef57048170fde1beb4e74c627f66796f"/>
+      <w:bookmarkStart w:id="30" w:name="Xea04b7eef57048170fde1beb4e74c627f66796f"/>
       <w:r>
         <w:t xml:space="preserve">5. Coach, not bouncer — how a read-only referee still drives quality</w:t>
       </w:r>
-      <w:bookmarkEnd w:id="28"/>
+      <w:bookmarkEnd w:id="30"/>
     </w:p>
     <w:p>
       <w:pPr>
@@ -2009,19 +2588,19 @@
         <w:t xml:space="preserve">bouncer</w:t>
       </w:r>
       <w:r>
-        <w:t xml:space="preserve">: it stands at the commit and says yes or no. But</w:t>
-      </w:r>
-      <w:r>
-        <w:t xml:space="preserve"> </w:t>
-      </w:r>
-      <w:r>
-        <w:t xml:space="preserve">a gate at commit is the most expensive possible place to catch a defect. Barry Boehm’s</w:t>
-      </w:r>
-      <w:r>
-        <w:t xml:space="preserve"> </w:t>
-      </w:r>
-      <w:r>
-        <w:t xml:space="preserve">cost-of-change data (</w:t>
+        <w:t xml:space="preserve">: it stands at the commit and says yes or no. The</w:t>
+      </w:r>
+      <w:r>
+        <w:t xml:space="preserve"> </w:t>
+      </w:r>
+      <w:r>
+        <w:t xml:space="preserve">case against the bouncer is usually made with Barry Boehm’s cost-of-change curve</w:t>
+      </w:r>
+      <w:r>
+        <w:t xml:space="preserve"> </w:t>
+      </w:r>
+      <w:r>
+        <w:t xml:space="preserve">(</w:t>
       </w:r>
       <w:r>
         <w:rPr>
@@ -2030,61 +2609,123 @@
         <w:t xml:space="preserve">Software Engineering Economics</w:t>
       </w:r>
       <w:r>
-        <w:t xml:space="preserve">, 1981, from defect data at TRW and IBM)</w:t>
-      </w:r>
-      <w:r>
-        <w:t xml:space="preserve"> </w:t>
-      </w:r>
-      <w:r>
-        <w:t xml:space="preserve">established the escalation that shift-left practice is built on: a defect corrected while the</w:t>
-      </w:r>
-      <w:r>
-        <w:t xml:space="preserve"> </w:t>
-      </w:r>
-      <w:r>
-        <w:t xml:space="preserve">requirement is still text costs almost nothing; the same defect corrected after design,</w:t>
-      </w:r>
-      <w:r>
-        <w:t xml:space="preserve"> </w:t>
-      </w:r>
-      <w:r>
-        <w:t xml:space="preserve">coding, and testing can cost on the order of 100× more — with intermediate figures often</w:t>
-      </w:r>
-      <w:r>
-        <w:t xml:space="preserve"> </w:t>
-      </w:r>
-      <w:r>
-        <w:t xml:space="preserve">cited around 1× at design, ~6× in implementation, ~15× in test, and 60–100× in</w:t>
-      </w:r>
-      <w:r>
-        <w:t xml:space="preserve"> </w:t>
-      </w:r>
-      <w:r>
-        <w:t xml:space="preserve">production.</w:t>
+        <w:t xml:space="preserve">, 1981) — the claim that a defect corrected late costs on</w:t>
+      </w:r>
+      <w:r>
+        <w:t xml:space="preserve"> </w:t>
+      </w:r>
+      <w:r>
+        <w:t xml:space="preserve">the order of 100× more than one corrected early. It is worth resisting the temptation to</w:t>
+      </w:r>
+      <w:r>
+        <w:t xml:space="preserve"> </w:t>
+      </w:r>
+      <w:r>
+        <w:t xml:space="preserve">lead with that curve, because the honest version of the story is more interesting and the</w:t>
+      </w:r>
+      <w:r>
+        <w:t xml:space="preserve"> </w:t>
+      </w:r>
+      <w:r>
+        <w:t xml:space="preserve">lazy version is exactly the kind of borrowed authority this project exists to refuse.</w:t>
+      </w:r>
+    </w:p>
+    <w:p>
+      <w:pPr>
+        <w:pStyle w:val="BodyText"/>
+      </w:pPr>
+      <w:r>
+        <w:t xml:space="preserve">Mike Cohn’s rebuttal is correct for most of its history.</w:t>
+      </w:r>
+      <w:r>
+        <w:t xml:space="preserve"> </w:t>
+      </w:r>
+      <w:r>
+        <w:rPr>
+          <w:b/>
+        </w:rPr>
+        <w:t xml:space="preserve">The Boehm curve did flatten, and</w:t>
+      </w:r>
+      <w:r>
+        <w:rPr>
+          <w:b/>
+        </w:rPr>
+        <w:t xml:space="preserve"> </w:t>
+      </w:r>
+      <w:r>
+        <w:rPr>
+          <w:b/>
+        </w:rPr>
+        <w:t xml:space="preserve">for decades it kept flattening:</w:t>
+      </w:r>
+      <w:r>
+        <w:t xml:space="preserve"> </w:t>
+      </w:r>
+      <w:r>
+        <w:t xml:space="preserve">IDEs, automated testing, continuous integration, modular</w:t>
+      </w:r>
+      <w:r>
+        <w:t xml:space="preserve"> </w:t>
+      </w:r>
+      <w:r>
+        <w:t xml:space="preserve">architecture, and agile’s short iterations each reduced what it costs to change working</w:t>
+      </w:r>
+      <w:r>
+        <w:t xml:space="preserve"> </w:t>
+      </w:r>
+      <w:r>
+        <w:t xml:space="preserve">software. Boehm’s coefficient was a snapshot of 1970s waterfall projects at TRW and IBM, and</w:t>
+      </w:r>
+      <w:r>
+        <w:t xml:space="preserve"> </w:t>
+      </w:r>
+      <w:r>
+        <w:t xml:space="preserve">treating a snapshot as a law of nature is the cosplay move — quoting a canon you have not</w:t>
+      </w:r>
+      <w:r>
+        <w:t xml:space="preserve"> </w:t>
+      </w:r>
+      <w:r>
+        <w:t xml:space="preserve">re-derived for the present world. A paper whose author interviewed the agile canon cannot lead</w:t>
+      </w:r>
+      <w:r>
+        <w:t xml:space="preserve"> </w:t>
+      </w:r>
+      <w:r>
+        <w:t xml:space="preserve">with the one curve that canon spent twenty years flattening.</w:t>
       </w:r>
       <w:r>
         <w:rPr>
           <w:rStyle w:val="FootnoteReference"/>
         </w:rPr>
-        <w:footnoteReference w:id="29"/>
-      </w:r>
-      <w:r>
-        <w:t xml:space="preserve"> </w:t>
-      </w:r>
-      <w:r>
-        <w:t xml:space="preserve">By the time code exists and sits at the commit gate, the defect is</w:t>
-      </w:r>
-      <w:r>
-        <w:t xml:space="preserve"> </w:t>
-      </w:r>
-      <w:r>
-        <w:t xml:space="preserve">already built, and the Builder is at maximum ship-pressure — the single worst moment to be</w:t>
-      </w:r>
-      <w:r>
-        <w:t xml:space="preserve"> </w:t>
-      </w:r>
-      <w:r>
-        <w:t xml:space="preserve">told to start over.</w:t>
+        <w:footnoteReference w:id="31"/>
+      </w:r>
+      <w:r>
+        <w:t xml:space="preserve"> </w:t>
+      </w:r>
+      <w:r>
+        <w:t xml:space="preserve">Cohn’s sharpest and</w:t>
+      </w:r>
+      <w:r>
+        <w:t xml:space="preserve"> </w:t>
+      </w:r>
+      <w:r>
+        <w:t xml:space="preserve">most durable observation is what remains once the coefficient is set aside: the dominant cost</w:t>
+      </w:r>
+      <w:r>
+        <w:t xml:space="preserve"> </w:t>
+      </w:r>
+      <w:r>
+        <w:t xml:space="preserve">of change is no longer development effort but</w:t>
+      </w:r>
+      <w:r>
+        <w:t xml:space="preserve"> </w:t>
+      </w:r>
+      <w:r>
+        <w:rPr>
+          <w:b/>
+        </w:rPr>
+        <w:t xml:space="preserve">feedback delay.</w:t>
       </w:r>
     </w:p>
     <w:p>
@@ -2092,6 +2733,593 @@
         <w:pStyle w:val="BodyText"/>
       </w:pPr>
       <w:r>
+        <w:t xml:space="preserve">But Cohn’s</w:t>
+      </w:r>
+      <w:r>
+        <w:t xml:space="preserve"> </w:t>
+      </w:r>
+      <w:r>
+        <w:rPr>
+          <w:i/>
+        </w:rPr>
+        <w:t xml:space="preserve">newest</w:t>
+      </w:r>
+      <w:r>
+        <w:t xml:space="preserve"> </w:t>
+      </w:r>
+      <w:r>
+        <w:t xml:space="preserve">claim — that AI is now flattening the curve</w:t>
+      </w:r>
+      <w:r>
+        <w:t xml:space="preserve"> </w:t>
+      </w:r>
+      <w:r>
+        <w:rPr>
+          <w:i/>
+        </w:rPr>
+        <w:t xml:space="preserve">again</w:t>
+      </w:r>
+      <w:r>
+        <w:t xml:space="preserve"> </w:t>
+      </w:r>
+      <w:r>
+        <w:t xml:space="preserve">— is the one step in</w:t>
+      </w:r>
+      <w:r>
+        <w:t xml:space="preserve"> </w:t>
+      </w:r>
+      <w:r>
+        <w:t xml:space="preserve">his argument the evidence does not yet support, and getting it right is the whole reason a</w:t>
+      </w:r>
+      <w:r>
+        <w:t xml:space="preserve"> </w:t>
+      </w:r>
+      <w:r>
+        <w:t xml:space="preserve">read-only referee earns its keep. AI lowers the cost of</w:t>
+      </w:r>
+      <w:r>
+        <w:t xml:space="preserve"> </w:t>
+      </w:r>
+      <w:r>
+        <w:rPr>
+          <w:i/>
+        </w:rPr>
+        <w:t xml:space="preserve">emitting</w:t>
+      </w:r>
+      <w:r>
+        <w:t xml:space="preserve"> </w:t>
+      </w:r>
+      <w:r>
+        <w:t xml:space="preserve">a change while raising the</w:t>
+      </w:r>
+      <w:r>
+        <w:t xml:space="preserve"> </w:t>
+      </w:r>
+      <w:r>
+        <w:t xml:space="preserve">cost of</w:t>
+      </w:r>
+      <w:r>
+        <w:t xml:space="preserve"> </w:t>
+      </w:r>
+      <w:r>
+        <w:rPr>
+          <w:i/>
+        </w:rPr>
+        <w:t xml:space="preserve">owning</w:t>
+      </w:r>
+      <w:r>
+        <w:t xml:space="preserve"> </w:t>
+      </w:r>
+      <w:r>
+        <w:t xml:space="preserve">it. GitClear’s analysis of 211 million changed lines finds code churn — lines</w:t>
+      </w:r>
+      <w:r>
+        <w:t xml:space="preserve"> </w:t>
+      </w:r>
+      <w:r>
+        <w:t xml:space="preserve">revised or reverted within two weeks of being written — roughly doubling as AI assistants</w:t>
+      </w:r>
+      <w:r>
+        <w:t xml:space="preserve"> </w:t>
+      </w:r>
+      <w:r>
+        <w:t xml:space="preserve">spread, from a pre-AI baseline near 3.3% toward 5.7% in 2024 and 7.1% in 2025; the share of</w:t>
+      </w:r>
+      <w:r>
+        <w:t xml:space="preserve"> </w:t>
+      </w:r>
+      <w:r>
+        <w:t xml:space="preserve">changes that are refactoring collapsed from about 25% (2021) to under 10% (2024) while</w:t>
+      </w:r>
+      <w:r>
+        <w:t xml:space="preserve"> </w:t>
+      </w:r>
+      <w:r>
+        <w:t xml:space="preserve">copy-pasted, cloned lines rose from 8.3% to 12.3% and, for the first time, overtook</w:t>
+      </w:r>
+      <w:r>
+        <w:t xml:space="preserve"> </w:t>
+      </w:r>
+      <w:r>
+        <w:t xml:space="preserve">moved-and-refactored code.</w:t>
+      </w:r>
+      <w:r>
+        <w:rPr>
+          <w:rStyle w:val="FootnoteReference"/>
+        </w:rPr>
+        <w:footnoteReference w:id="32"/>
+      </w:r>
+      <w:r>
+        <w:t xml:space="preserve"> </w:t>
+      </w:r>
+      <w:r>
+        <w:t xml:space="preserve">That is the empirical shape of</w:t>
+      </w:r>
+      <w:r>
+        <w:t xml:space="preserve"> </w:t>
+      </w:r>
+      <w:r>
+        <w:t xml:space="preserve">“</w:t>
+      </w:r>
+      <w:r>
+        <w:t xml:space="preserve">AI slop</w:t>
+      </w:r>
+      <w:r>
+        <w:t xml:space="preserve">”</w:t>
+      </w:r>
+      <w:r>
+        <w:t xml:space="preserve">: output that is</w:t>
+      </w:r>
+      <w:r>
+        <w:t xml:space="preserve"> </w:t>
+      </w:r>
+      <w:r>
+        <w:t xml:space="preserve">cheap to generate and expensive to live with. AI did not flatten the curve — it</w:t>
+      </w:r>
+      <w:r>
+        <w:t xml:space="preserve"> </w:t>
+      </w:r>
+      <w:r>
+        <w:rPr>
+          <w:i/>
+        </w:rPr>
+        <w:t xml:space="preserve">moved the</w:t>
+      </w:r>
+      <w:r>
+        <w:rPr>
+          <w:i/>
+        </w:rPr>
+        <w:t xml:space="preserve"> </w:t>
+      </w:r>
+      <w:r>
+        <w:rPr>
+          <w:i/>
+        </w:rPr>
+        <w:t xml:space="preserve">cost off the keystroke and onto the ledger</w:t>
+      </w:r>
+      <w:r>
+        <w:t xml:space="preserve">, where it shows up as churn, duplication, and</w:t>
+      </w:r>
+      <w:r>
+        <w:t xml:space="preserve"> </w:t>
+      </w:r>
+      <w:r>
+        <w:t xml:space="preserve">tokens spent regenerating what a moment’s earlier feedback would have prevented. The marginal</w:t>
+      </w:r>
+      <w:r>
+        <w:t xml:space="preserve"> </w:t>
+      </w:r>
+      <w:r>
+        <w:t xml:space="preserve">line of code got cheaper; the codebase did not. What accrues instead is the structure every</w:t>
+      </w:r>
+      <w:r>
+        <w:t xml:space="preserve"> </w:t>
+      </w:r>
+      <w:r>
+        <w:t xml:space="preserve">engineer knows on sight — held together with duct tape, bubble gum, and paper clips, each patch</w:t>
+      </w:r>
+      <w:r>
+        <w:t xml:space="preserve"> </w:t>
+      </w:r>
+      <w:r>
+        <w:t xml:space="preserve">cheap to add and the whole increasingly expensive to touch. This is legacy code arriving at</w:t>
+      </w:r>
+      <w:r>
+        <w:t xml:space="preserve"> </w:t>
+      </w:r>
+      <w:r>
+        <w:t xml:space="preserve">machine speed, and it is precisely the condition the craftsmanship canon — Bernstein’s</w:t>
+      </w:r>
+      <w:r>
+        <w:t xml:space="preserve"> </w:t>
+      </w:r>
+      <w:r>
+        <w:rPr>
+          <w:i/>
+        </w:rPr>
+        <w:t xml:space="preserve">Beyond</w:t>
+      </w:r>
+      <w:r>
+        <w:rPr>
+          <w:i/>
+        </w:rPr>
+        <w:t xml:space="preserve"> </w:t>
+      </w:r>
+      <w:r>
+        <w:rPr>
+          <w:i/>
+        </w:rPr>
+        <w:t xml:space="preserve">Legacy Code</w:t>
+      </w:r>
+      <w:r>
+        <w:t xml:space="preserve">, Feathers’ work on legacy seams — was written to prevent.</w:t>
+      </w:r>
+    </w:p>
+    <w:p>
+      <w:pPr>
+        <w:pStyle w:val="BodyText"/>
+      </w:pPr>
+      <w:r>
+        <w:t xml:space="preserve">Call this</w:t>
+      </w:r>
+      <w:r>
+        <w:t xml:space="preserve"> </w:t>
+      </w:r>
+      <w:r>
+        <w:rPr>
+          <w:b/>
+        </w:rPr>
+        <w:t xml:space="preserve">Sloponomics</w:t>
+      </w:r>
+      <w:r>
+        <w:t xml:space="preserve">:</w:t>
+      </w:r>
+      <w:r>
+        <w:t xml:space="preserve"> </w:t>
+      </w:r>
+      <w:r>
+        <w:rPr>
+          <w:i/>
+        </w:rPr>
+        <w:t xml:space="preserve">the economics of output that is cheap to emit and expensive to</w:t>
+      </w:r>
+      <w:r>
+        <w:rPr>
+          <w:i/>
+        </w:rPr>
+        <w:t xml:space="preserve"> </w:t>
+      </w:r>
+      <w:r>
+        <w:rPr>
+          <w:i/>
+        </w:rPr>
+        <w:t xml:space="preserve">own.</w:t>
+      </w:r>
+      <w:r>
+        <w:t xml:space="preserve"> </w:t>
+      </w:r>
+      <w:r>
+        <w:t xml:space="preserve">Its first law is that lowering the cost of production does not lower the cost of quality</w:t>
+      </w:r>
+      <w:r>
+        <w:t xml:space="preserve"> </w:t>
+      </w:r>
+      <w:r>
+        <w:t xml:space="preserve">— it relocates it, from the moment of authorship to the downstream ledger of rework, review,</w:t>
+      </w:r>
+      <w:r>
+        <w:t xml:space="preserve"> </w:t>
+      </w:r>
+      <w:r>
+        <w:t xml:space="preserve">retention, and (in regulated domains) penalty. Sloponomics predicts that any actor able to emit</w:t>
+      </w:r>
+      <w:r>
+        <w:t xml:space="preserve"> </w:t>
+      </w:r>
+      <w:r>
+        <w:t xml:space="preserve">cheaply and defer the ownership cost will do exactly that, because the costs land in different</w:t>
+      </w:r>
+      <w:r>
+        <w:t xml:space="preserve"> </w:t>
+      </w:r>
+      <w:r>
+        <w:t xml:space="preserve">columns and often on different people; the emitter is rewarded for volume while someone</w:t>
+      </w:r>
+      <w:r>
+        <w:t xml:space="preserve"> </w:t>
+      </w:r>
+      <w:r>
+        <w:t xml:space="preserve">downstream pays for coherence. This is not a claim about AI’s ceiling — it is a claim about its</w:t>
+      </w:r>
+      <w:r>
+        <w:t xml:space="preserve"> </w:t>
+      </w:r>
+      <w:r>
+        <w:rPr>
+          <w:i/>
+        </w:rPr>
+        <w:t xml:space="preserve">incentive gradient</w:t>
+      </w:r>
+      <w:r>
+        <w:t xml:space="preserve">, and it is why</w:t>
+      </w:r>
+      <w:r>
+        <w:t xml:space="preserve"> </w:t>
+      </w:r>
+      <w:r>
+        <w:t xml:space="preserve">“</w:t>
+      </w:r>
+      <w:r>
+        <w:t xml:space="preserve">the model got better</w:t>
+      </w:r>
+      <w:r>
+        <w:t xml:space="preserve">”</w:t>
+      </w:r>
+      <w:r>
+        <w:t xml:space="preserve"> </w:t>
+      </w:r>
+      <w:r>
+        <w:t xml:space="preserve">never resolves the problem on its</w:t>
+      </w:r>
+      <w:r>
+        <w:t xml:space="preserve"> </w:t>
+      </w:r>
+      <w:r>
+        <w:t xml:space="preserve">own. A better model emits better slop faster; it does not change which column the cost lands in.</w:t>
+      </w:r>
+      <w:r>
+        <w:t xml:space="preserve"> </w:t>
+      </w:r>
+      <w:r>
+        <w:t xml:space="preserve">The only thing that moves the cost back to the point of authorship — where it is cheapest to</w:t>
+      </w:r>
+      <w:r>
+        <w:t xml:space="preserve"> </w:t>
+      </w:r>
+      <w:r>
+        <w:t xml:space="preserve">pay — is a standard applied</w:t>
+      </w:r>
+      <w:r>
+        <w:t xml:space="preserve"> </w:t>
+      </w:r>
+      <w:r>
+        <w:rPr>
+          <w:i/>
+        </w:rPr>
+        <w:t xml:space="preserve">at</w:t>
+      </w:r>
+      <w:r>
+        <w:t xml:space="preserve"> </w:t>
+      </w:r>
+      <w:r>
+        <w:t xml:space="preserve">authorship, continuously, by an authority the emitter cannot</w:t>
+      </w:r>
+      <w:r>
+        <w:t xml:space="preserve"> </w:t>
+      </w:r>
+      <w:r>
+        <w:t xml:space="preserve">switch off. That authority is the read-only Antagonist, and Sloponomics is the reason it is an</w:t>
+      </w:r>
+      <w:r>
+        <w:t xml:space="preserve"> </w:t>
+      </w:r>
+      <w:r>
+        <w:t xml:space="preserve">economic instrument, not a compliance nicety.</w:t>
+      </w:r>
+    </w:p>
+    <w:p>
+      <w:pPr>
+        <w:pStyle w:val="BodyText"/>
+      </w:pPr>
+      <w:r>
+        <w:t xml:space="preserve">And in the domain this platform is built for, the far end of the curve is not flat at all — it</w:t>
+      </w:r>
+      <w:r>
+        <w:t xml:space="preserve"> </w:t>
+      </w:r>
+      <w:r>
+        <w:t xml:space="preserve">is a fine. The recordkeeping primitives a regulator cares about (retention, immutability,</w:t>
+      </w:r>
+      <w:r>
+        <w:t xml:space="preserve"> </w:t>
+      </w:r>
+      <w:r>
+        <w:t xml:space="preserve">traceability, human accountability) price ungoverned output directly: in 2024 the SEC settled</w:t>
+      </w:r>
+      <w:r>
+        <w:t xml:space="preserve"> </w:t>
+      </w:r>
+      <w:r>
+        <w:t xml:space="preserve">off-channel-communication and books-and-records failures with twenty-six firms for</w:t>
+      </w:r>
+      <w:r>
+        <w:t xml:space="preserve"> </w:t>
+      </w:r>
+      <w:r>
+        <w:rPr>
+          <w:b/>
+        </w:rPr>
+        <w:t xml:space="preserve">$392.75</w:t>
+      </w:r>
+      <w:r>
+        <w:rPr>
+          <w:b/>
+        </w:rPr>
+        <w:t xml:space="preserve"> </w:t>
+      </w:r>
+      <w:r>
+        <w:rPr>
+          <w:b/>
+        </w:rPr>
+        <w:t xml:space="preserve">million</w:t>
+      </w:r>
+      <w:r>
+        <w:t xml:space="preserve">, alongside a further eleven-firm, $88-million wave, and FINRA brought its own actions</w:t>
+      </w:r>
+      <w:r>
+        <w:t xml:space="preserve"> </w:t>
+      </w:r>
+      <w:r>
+        <w:t xml:space="preserve">(e.g. BTIG, $600,000) — one front in a multi-year, multi-billion-dollar sweep.</w:t>
+      </w:r>
+      <w:r>
+        <w:rPr>
+          <w:rStyle w:val="FootnoteReference"/>
+        </w:rPr>
+        <w:footnoteReference w:id="33"/>
+      </w:r>
+      <w:r>
+        <w:t xml:space="preserve"> </w:t>
+      </w:r>
+      <w:r>
+        <w:t xml:space="preserve">Ungoverned communications and ungoverned code are the same governance failure in different</w:t>
+      </w:r>
+      <w:r>
+        <w:t xml:space="preserve"> </w:t>
+      </w:r>
+      <w:r>
+        <w:t xml:space="preserve">media: artifacts that no read-only authority reviewed, retained, or could later prove were</w:t>
+      </w:r>
+      <w:r>
+        <w:t xml:space="preserve"> </w:t>
+      </w:r>
+      <w:r>
+        <w:t xml:space="preserve">produced to standard. In a regulated context the cost of change is dominated by the cost of the</w:t>
+      </w:r>
+      <w:r>
+        <w:t xml:space="preserve"> </w:t>
+      </w:r>
+      <w:r>
+        <w:t xml:space="preserve">change you cannot account for — which is the steep NASA end of the split, not the flat web-app</w:t>
+      </w:r>
+      <w:r>
+        <w:t xml:space="preserve"> </w:t>
+      </w:r>
+      <w:r>
+        <w:t xml:space="preserve">end, and it is exactly the market that matters here.</w:t>
+      </w:r>
+    </w:p>
+    <w:p>
+      <w:pPr>
+        <w:pStyle w:val="BodyText"/>
+      </w:pPr>
+      <w:r>
+        <w:t xml:space="preserve">The durable argument survives every version of Cohn’s rebuttal, because it never needed the</w:t>
+      </w:r>
+      <w:r>
+        <w:t xml:space="preserve"> </w:t>
+      </w:r>
+      <w:r>
+        <w:t xml:space="preserve">coefficient — and the churn data makes it stronger, not weaker. Restate the economics honestly:</w:t>
+      </w:r>
+      <w:r>
+        <w:t xml:space="preserve"> </w:t>
+      </w:r>
+      <w:r>
+        <w:t xml:space="preserve">what AI has made cheap is</w:t>
+      </w:r>
+      <w:r>
+        <w:t xml:space="preserve"> </w:t>
+      </w:r>
+      <w:r>
+        <w:rPr>
+          <w:i/>
+        </w:rPr>
+        <w:t xml:space="preserve">emitting</w:t>
+      </w:r>
+      <w:r>
+        <w:t xml:space="preserve"> </w:t>
+      </w:r>
+      <w:r>
+        <w:t xml:space="preserve">code; what has become</w:t>
+      </w:r>
+      <w:r>
+        <w:t xml:space="preserve"> </w:t>
+      </w:r>
+      <w:r>
+        <w:rPr>
+          <w:i/>
+        </w:rPr>
+        <w:t xml:space="preserve">more</w:t>
+      </w:r>
+      <w:r>
+        <w:t xml:space="preserve"> </w:t>
+      </w:r>
+      <w:r>
+        <w:t xml:space="preserve">expensive, in aggregate, is</w:t>
+      </w:r>
+      <w:r>
+        <w:t xml:space="preserve"> </w:t>
+      </w:r>
+      <w:r>
+        <w:t xml:space="preserve">owning it — the rework, the duplication, and the standing question of whether any of it meets a</w:t>
+      </w:r>
+      <w:r>
+        <w:t xml:space="preserve"> </w:t>
+      </w:r>
+      <w:r>
+        <w:t xml:space="preserve">standard, coheres as a spec, or was wanted at all. You are always spending to learn. The only</w:t>
+      </w:r>
+      <w:r>
+        <w:t xml:space="preserve"> </w:t>
+      </w:r>
+      <w:r>
+        <w:t xml:space="preserve">thing a quality function can change is</w:t>
+      </w:r>
+      <w:r>
+        <w:t xml:space="preserve"> </w:t>
+      </w:r>
+      <w:r>
+        <w:rPr>
+          <w:i/>
+        </w:rPr>
+        <w:t xml:space="preserve">when</w:t>
+      </w:r>
+      <w:r>
+        <w:t xml:space="preserve"> </w:t>
+      </w:r>
+      <w:r>
+        <w:t xml:space="preserve">that spend happens, and therefore how much of it is</w:t>
+      </w:r>
+      <w:r>
+        <w:t xml:space="preserve"> </w:t>
+      </w:r>
+      <w:r>
+        <w:t xml:space="preserve">wasted as churn or paid as a fine. Cohn’s own conclusion is the whole case for the Antagonist,</w:t>
+      </w:r>
+      <w:r>
+        <w:t xml:space="preserve"> </w:t>
+      </w:r>
+      <w:r>
+        <w:t xml:space="preserve">stated by the opposition:</w:t>
+      </w:r>
+      <w:r>
+        <w:t xml:space="preserve"> </w:t>
+      </w:r>
+      <w:r>
+        <w:rPr>
+          <w:i/>
+        </w:rPr>
+        <w:t xml:space="preserve">the biggest risk is no longer changing too late — it is waiting too</w:t>
+      </w:r>
+      <w:r>
+        <w:rPr>
+          <w:i/>
+        </w:rPr>
+        <w:t xml:space="preserve"> </w:t>
+      </w:r>
+      <w:r>
+        <w:rPr>
+          <w:i/>
+        </w:rPr>
+        <w:t xml:space="preserve">long to learn.</w:t>
+      </w:r>
+    </w:p>
+    <w:p>
+      <w:pPr>
+        <w:pStyle w:val="BodyText"/>
+      </w:pPr>
+      <w:r>
         <w:t xml:space="preserve">The</w:t>
       </w:r>
       <w:r>
@@ -2107,7 +3335,13 @@
         <w:t xml:space="preserve"> </w:t>
       </w:r>
       <w:r>
-        <w:t xml:space="preserve">design keeps the read-only constraint but moves the enforcer’s</w:t>
+        <w:t xml:space="preserve">design is a machine for not waiting. It keeps the read-only constraint and moves</w:t>
+      </w:r>
+      <w:r>
+        <w:t xml:space="preserve"> </w:t>
+      </w:r>
+      <w:r>
+        <w:t xml:space="preserve">the enforcer’s</w:t>
       </w:r>
       <w:r>
         <w:t xml:space="preserve"> </w:t>
@@ -2122,70 +3356,243 @@
         <w:t xml:space="preserve"> </w:t>
       </w:r>
       <w:r>
-        <w:t xml:space="preserve">earlier.</w:t>
-      </w:r>
-      <w:r>
-        <w:t xml:space="preserve"> </w:t>
-      </w:r>
-      <w:r>
-        <w:t xml:space="preserve">The Antagonist advises continuously during the build — reading each artifact as it forms,</w:t>
-      </w:r>
-      <w:r>
-        <w:t xml:space="preserve"> </w:t>
-      </w:r>
-      <w:r>
-        <w:t xml:space="preserve">naming the complexity creeping into a function, flagging the acceptance criterion that has no</w:t>
-      </w:r>
-      <w:r>
-        <w:t xml:space="preserve"> </w:t>
-      </w:r>
-      <w:r>
-        <w:t xml:space="preserve">scenario yet — while the Builder is still cheaply able to change course and before</w:t>
-      </w:r>
-      <w:r>
-        <w:t xml:space="preserve"> </w:t>
-      </w:r>
-      <w:r>
-        <w:t xml:space="preserve">ship-pressure has peaked. It never writes. The Builder writes. Separation of powers is fully</w:t>
-      </w:r>
-      <w:r>
-        <w:t xml:space="preserve"> </w:t>
-      </w:r>
-      <w:r>
-        <w:t xml:space="preserve">intact: the coach describes what is wrong and how to fix it, in priority order, and the</w:t>
-      </w:r>
-      <w:r>
-        <w:t xml:space="preserve"> </w:t>
-      </w:r>
-      <w:r>
-        <w:t xml:space="preserve">Builder decides and acts. This is shift-left pointed at the quality function itself, and it</w:t>
-      </w:r>
-      <w:r>
-        <w:t xml:space="preserve"> </w:t>
-      </w:r>
-      <w:r>
-        <w:t xml:space="preserve">is strictly better than the bouncer on two axes at once — defects are caught where they are</w:t>
-      </w:r>
-      <w:r>
-        <w:t xml:space="preserve"> </w:t>
-      </w:r>
-      <w:r>
-        <w:t xml:space="preserve">cheap,</w:t>
-      </w:r>
-      <w:r>
-        <w:t xml:space="preserve"> </w:t>
-      </w:r>
-      <w:r>
-        <w:rPr>
-          <w:i/>
-        </w:rPr>
-        <w:t xml:space="preserve">and</w:t>
-      </w:r>
-      <w:r>
-        <w:t xml:space="preserve"> </w:t>
-      </w:r>
-      <w:r>
-        <w:t xml:space="preserve">the enforcer’s authority is undiminished because it still never touches the pen.</w:t>
+        <w:t xml:space="preserve">to the front of the loop. The Antagonist advises continuously during the</w:t>
+      </w:r>
+      <w:r>
+        <w:t xml:space="preserve"> </w:t>
+      </w:r>
+      <w:r>
+        <w:t xml:space="preserve">build — reading each artifact as it forms, naming the complexity creeping into a function,</w:t>
+      </w:r>
+      <w:r>
+        <w:t xml:space="preserve"> </w:t>
+      </w:r>
+      <w:r>
+        <w:t xml:space="preserve">flagging the acceptance criterion that still has no scenario — so the Builder</w:t>
+      </w:r>
+      <w:r>
+        <w:t xml:space="preserve"> </w:t>
+      </w:r>
+      <w:r>
+        <w:rPr>
+          <w:i/>
+        </w:rPr>
+        <w:t xml:space="preserve">learns the</w:t>
+      </w:r>
+      <w:r>
+        <w:rPr>
+          <w:i/>
+        </w:rPr>
+        <w:t xml:space="preserve"> </w:t>
+      </w:r>
+      <w:r>
+        <w:rPr>
+          <w:i/>
+        </w:rPr>
+        <w:t xml:space="preserve">standard while the code is still a thought</w:t>
+      </w:r>
+      <w:r>
+        <w:t xml:space="preserve">, not at the commit gate where it is already built</w:t>
+      </w:r>
+      <w:r>
+        <w:t xml:space="preserve"> </w:t>
+      </w:r>
+      <w:r>
+        <w:t xml:space="preserve">and ship-pressure has peaked. Continuous coaching also collects the dividend Section 4.1 predicts:</w:t>
+      </w:r>
+      <w:r>
+        <w:t xml:space="preserve"> </w:t>
+      </w:r>
+      <w:r>
+        <w:t xml:space="preserve">each pass is a short, fresh read — the artifact plus the constitution — so the referee never</w:t>
+      </w:r>
+      <w:r>
+        <w:t xml:space="preserve"> </w:t>
+      </w:r>
+      <w:r>
+        <w:t xml:space="preserve">accumulates the rotted window the Builder is fighting; it sits in the green zone of Figure 2 by</w:t>
+      </w:r>
+      <w:r>
+        <w:t xml:space="preserve"> </w:t>
+      </w:r>
+      <w:r>
+        <w:t xml:space="preserve">construction, judging a bounded thing against a fixed standard while the Builder’s context fills.</w:t>
+      </w:r>
+      <w:r>
+        <w:t xml:space="preserve"> </w:t>
+      </w:r>
+      <w:r>
+        <w:t xml:space="preserve">It never writes; the Builder writes. Separation of powers is fully</w:t>
+      </w:r>
+      <w:r>
+        <w:t xml:space="preserve"> </w:t>
+      </w:r>
+      <w:r>
+        <w:t xml:space="preserve">intact: the coach describes what is wrong and how to fix it, in priority order, and the Builder</w:t>
+      </w:r>
+      <w:r>
+        <w:t xml:space="preserve"> </w:t>
+      </w:r>
+      <w:r>
+        <w:t xml:space="preserve">decides and acts. This is not</w:t>
+      </w:r>
+      <w:r>
+        <w:t xml:space="preserve"> </w:t>
+      </w:r>
+      <w:r>
+        <w:t xml:space="preserve">“</w:t>
+      </w:r>
+      <w:r>
+        <w:t xml:space="preserve">catch the defect before it costs 100×.</w:t>
+      </w:r>
+      <w:r>
+        <w:t xml:space="preserve">”</w:t>
+      </w:r>
+      <w:r>
+        <w:t xml:space="preserve"> </w:t>
+      </w:r>
+      <w:r>
+        <w:t xml:space="preserve">It is the thing Cohn</w:t>
+      </w:r>
+      <w:r>
+        <w:t xml:space="preserve"> </w:t>
+      </w:r>
+      <w:r>
+        <w:t xml:space="preserve">says actually matters now:</w:t>
+      </w:r>
+      <w:r>
+        <w:t xml:space="preserve"> </w:t>
+      </w:r>
+      <w:r>
+        <w:rPr>
+          <w:b/>
+        </w:rPr>
+        <w:t xml:space="preserve">collapse the feedback delay</w:t>
+      </w:r>
+      <w:r>
+        <w:t xml:space="preserve"> </w:t>
+      </w:r>
+      <w:r>
+        <w:t xml:space="preserve">between doing the wrong thing and</w:t>
+      </w:r>
+      <w:r>
+        <w:t xml:space="preserve"> </w:t>
+      </w:r>
+      <w:r>
+        <w:t xml:space="preserve">learning it, on the one axis — quality against a fixed standard — where the loop can be closed</w:t>
+      </w:r>
+      <w:r>
+        <w:t xml:space="preserve"> </w:t>
+      </w:r>
+      <w:r>
+        <w:t xml:space="preserve">in the same second the code is written.</w:t>
+      </w:r>
+    </w:p>
+    <w:p>
+      <w:pPr>
+        <w:pStyle w:val="BodyText"/>
+      </w:pPr>
+      <w:r>
+        <w:t xml:space="preserve">There is a second-order point that turns the whole objection from a threat into reinforcement.</w:t>
+      </w:r>
+      <w:r>
+        <w:t xml:space="preserve"> </w:t>
+      </w:r>
+      <w:r>
+        <w:t xml:space="preserve">If AI makes</w:t>
+      </w:r>
+      <w:r>
+        <w:t xml:space="preserve"> </w:t>
+      </w:r>
+      <w:r>
+        <w:rPr>
+          <w:i/>
+        </w:rPr>
+        <w:t xml:space="preserve">emitting</w:t>
+      </w:r>
+      <w:r>
+        <w:t xml:space="preserve"> </w:t>
+      </w:r>
+      <w:r>
+        <w:t xml:space="preserve">change nearly free, the intuitive conclusion is that discipline matters</w:t>
+      </w:r>
+      <w:r>
+        <w:t xml:space="preserve"> </w:t>
+      </w:r>
+      <w:r>
+        <w:t xml:space="preserve">less — just regenerate it. The opposite is true, and the churn data is that opposite already</w:t>
+      </w:r>
+      <w:r>
+        <w:t xml:space="preserve"> </w:t>
+      </w:r>
+      <w:r>
+        <w:t xml:space="preserve">visible in the wild. When emission is cheap,</w:t>
+      </w:r>
+      <w:r>
+        <w:t xml:space="preserve"> </w:t>
+      </w:r>
+      <w:r>
+        <w:rPr>
+          <w:i/>
+        </w:rPr>
+        <w:t xml:space="preserve">volume</w:t>
+      </w:r>
+      <w:r>
+        <w:t xml:space="preserve"> </w:t>
+      </w:r>
+      <w:r>
+        <w:t xml:space="preserve">explodes; a balancing loop with nothing</w:t>
+      </w:r>
+      <w:r>
+        <w:t xml:space="preserve"> </w:t>
+      </w:r>
+      <w:r>
+        <w:t xml:space="preserve">fixed to balance against does not hold; and cheap emission plus a writable gate is precisely the</w:t>
+      </w:r>
+      <w:r>
+        <w:t xml:space="preserve"> </w:t>
+      </w:r>
+      <w:r>
+        <w:t xml:space="preserve">mouse-cookie reinforcing loop of Section 4 running at machine speed — its residue is the doubled churn,</w:t>
+      </w:r>
+      <w:r>
+        <w:t xml:space="preserve"> </w:t>
+      </w:r>
+      <w:r>
+        <w:t xml:space="preserve">the collapsed refactoring, and the rising clone count. The cheaper it becomes to produce code,</w:t>
+      </w:r>
+      <w:r>
+        <w:t xml:space="preserve"> </w:t>
+      </w:r>
+      <w:r>
+        <w:t xml:space="preserve">the more the one thing that must</w:t>
+      </w:r>
+      <w:r>
+        <w:t xml:space="preserve"> </w:t>
+      </w:r>
+      <w:r>
+        <w:rPr>
+          <w:b/>
+        </w:rPr>
+        <w:t xml:space="preserve">not</w:t>
+      </w:r>
+      <w:r>
+        <w:t xml:space="preserve"> </w:t>
+      </w:r>
+      <w:r>
+        <w:t xml:space="preserve">be cheap to change is the standard the code is produced</w:t>
+      </w:r>
+      <w:r>
+        <w:t xml:space="preserve"> </w:t>
+      </w:r>
+      <w:r>
+        <w:t xml:space="preserve">against. A cheap-emission world does not need a read-only referee less; it is the first world</w:t>
+      </w:r>
+      <w:r>
+        <w:t xml:space="preserve"> </w:t>
+      </w:r>
+      <w:r>
+        <w:t xml:space="preserve">that cannot function without one.</w:t>
       </w:r>
     </w:p>
     <w:p>
@@ -2446,11 +3853,11 @@
       <w:pPr>
         <w:pStyle w:val="Heading2"/>
       </w:pPr>
-      <w:bookmarkStart w:id="30" w:name="limits-and-threats-to-validity"/>
+      <w:bookmarkStart w:id="34" w:name="limits-and-threats-to-validity"/>
       <w:r>
         <w:t xml:space="preserve">6. Limits and threats to validity</w:t>
       </w:r>
-      <w:bookmarkEnd w:id="30"/>
+      <w:bookmarkEnd w:id="34"/>
     </w:p>
     <w:p>
       <w:pPr>
@@ -2598,7 +4005,7 @@
         <w:t xml:space="preserve"> </w:t>
       </w:r>
       <w:r>
-        <w:t xml:space="preserve">The bimodal coverage split (§3) is consistent with the</w:t>
+        <w:t xml:space="preserve">The bimodal coverage split (Section 3) is consistent with the</w:t>
       </w:r>
       <w:r>
         <w:t xml:space="preserve"> </w:t>
@@ -2647,6 +4054,104 @@
       </w:r>
       <w:r>
         <w:t xml:space="preserve">probative.</w:t>
+      </w:r>
+    </w:p>
+    <w:p>
+      <w:pPr>
+        <w:pStyle w:val="BodyText"/>
+      </w:pPr>
+      <w:r>
+        <w:rPr>
+          <w:b/>
+        </w:rPr>
+        <w:t xml:space="preserve">Figure 2 is schematic, and context rot is a moving target.</w:t>
+      </w:r>
+      <w:r>
+        <w:t xml:space="preserve"> </w:t>
+      </w:r>
+      <w:r>
+        <w:t xml:space="preserve">The curves in Figure 2</w:t>
+      </w:r>
+      <w:r>
+        <w:t xml:space="preserve"> </w:t>
+      </w:r>
+      <w:r>
+        <w:t xml:space="preserve">illustrate Chroma’s qualitative finding, not their per-model measurements; the reader should</w:t>
+      </w:r>
+      <w:r>
+        <w:t xml:space="preserve"> </w:t>
+      </w:r>
+      <w:r>
+        <w:t xml:space="preserve">take the shape (reliability falls well before the window is full) and not the exact numbers.</w:t>
+      </w:r>
+      <w:r>
+        <w:t xml:space="preserve"> </w:t>
+      </w:r>
+      <w:r>
+        <w:t xml:space="preserve">Context-handling is also the most actively-optimized frontier in the field — the specific token</w:t>
+      </w:r>
+      <w:r>
+        <w:t xml:space="preserve"> </w:t>
+      </w:r>
+      <w:r>
+        <w:t xml:space="preserve">at which a given model rots will move with every release, and a future architecture could in</w:t>
+      </w:r>
+      <w:r>
+        <w:t xml:space="preserve"> </w:t>
+      </w:r>
+      <w:r>
+        <w:t xml:space="preserve">principle flatten the curve the way agile flattened Boehm’s. The argument survives that: even a</w:t>
+      </w:r>
+      <w:r>
+        <w:t xml:space="preserve"> </w:t>
+      </w:r>
+      <w:r>
+        <w:t xml:space="preserve">flatter rot curve leaves the</w:t>
+      </w:r>
+      <w:r>
+        <w:t xml:space="preserve"> </w:t>
+      </w:r>
+      <w:r>
+        <w:rPr>
+          <w:i/>
+        </w:rPr>
+        <w:t xml:space="preserve">ordering</w:t>
+      </w:r>
+      <w:r>
+        <w:t xml:space="preserve"> </w:t>
+      </w:r>
+      <w:r>
+        <w:t xml:space="preserve">intact — the Builder’s window is most burdened at the</w:t>
+      </w:r>
+      <w:r>
+        <w:t xml:space="preserve"> </w:t>
+      </w:r>
+      <w:r>
+        <w:t xml:space="preserve">end of the job — and</w:t>
+      </w:r>
+      <w:r>
+        <w:t xml:space="preserve"> </w:t>
+      </w:r>
+      <w:r>
+        <w:t xml:space="preserve">“</w:t>
+      </w:r>
+      <w:r>
+        <w:t xml:space="preserve">separation of context</w:t>
+      </w:r>
+      <w:r>
+        <w:t xml:space="preserve">”</w:t>
+      </w:r>
+      <w:r>
+        <w:t xml:space="preserve"> </w:t>
+      </w:r>
+      <w:r>
+        <w:t xml:space="preserve">costs nothing to adopt now and degrades gracefully</w:t>
+      </w:r>
+      <w:r>
+        <w:t xml:space="preserve"> </w:t>
+      </w:r>
+      <w:r>
+        <w:t xml:space="preserve">if rot is later solved.</w:t>
       </w:r>
     </w:p>
     <w:p>
@@ -2815,7 +4320,7 @@
         <w:t xml:space="preserve"> </w:t>
       </w:r>
       <w:r>
-        <w:t xml:space="preserve">authority, and §4’s</w:t>
+        <w:t xml:space="preserve">authority, and Section 4’s</w:t>
       </w:r>
       <w:r>
         <w:t xml:space="preserve"> </w:t>
@@ -2866,7 +4371,7 @@
         <w:t xml:space="preserve"> </w:t>
       </w:r>
       <w:r>
-        <w:t xml:space="preserve">escape rate, same coverage fingerprint — then the §5 claim that read-only</w:t>
+        <w:t xml:space="preserve">escape rate, same coverage fingerprint — then the Section 5 claim that read-only</w:t>
       </w:r>
       <w:r>
         <w:t xml:space="preserve"> </w:t>
@@ -2937,6 +4442,66 @@
     </w:p>
     <w:p>
       <w:pPr>
+        <w:numPr>
+          <w:ilvl w:val="0"/>
+          <w:numId w:val="1001"/>
+        </w:numPr>
+        <w:pStyle w:val="Compact"/>
+      </w:pPr>
+      <w:r>
+        <w:rPr>
+          <w:b/>
+        </w:rPr>
+        <w:t xml:space="preserve">Sloponomics disconfirmed.</w:t>
+      </w:r>
+      <w:r>
+        <w:t xml:space="preserve"> </w:t>
+      </w:r>
+      <w:r>
+        <w:t xml:space="preserve">The churn evidence for Section 5 is correlational — AI adoption and</w:t>
+      </w:r>
+      <w:r>
+        <w:t xml:space="preserve"> </w:t>
+      </w:r>
+      <w:r>
+        <w:t xml:space="preserve">rising churn coincide in the GitClear corpus, but the corpus does not isolate cause. If a</w:t>
+      </w:r>
+      <w:r>
+        <w:t xml:space="preserve"> </w:t>
+      </w:r>
+      <w:r>
+        <w:t xml:space="preserve">controlled study held team, domain, and tenure fixed and found that AI assistance</w:t>
+      </w:r>
+      <w:r>
+        <w:t xml:space="preserve"> </w:t>
+      </w:r>
+      <w:r>
+        <w:rPr>
+          <w:i/>
+        </w:rPr>
+        <w:t xml:space="preserve">lowered</w:t>
+      </w:r>
+      <w:r>
+        <w:t xml:space="preserve"> </w:t>
+      </w:r>
+      <w:r>
+        <w:t xml:space="preserve">downstream rework, review load, and ownership cost — not just authorship time — then</w:t>
+      </w:r>
+      <w:r>
+        <w:t xml:space="preserve"> </w:t>
+      </w:r>
+      <w:r>
+        <w:t xml:space="preserve">Sloponomics is wrong about the incentive gradient, the cost did flatten rather than relocate,</w:t>
+      </w:r>
+      <w:r>
+        <w:t xml:space="preserve"> </w:t>
+      </w:r>
+      <w:r>
+        <w:t xml:space="preserve">and the economic case for coaching-at-authorship weakens to an aesthetic preference.</w:t>
+      </w:r>
+    </w:p>
+    <w:p>
+      <w:pPr>
         <w:pStyle w:val="FirstParagraph"/>
       </w:pPr>
       <w:r>
@@ -2973,7 +4538,7 @@
         <w:t xml:space="preserve"> </w:t>
       </w:r>
       <w:r>
-        <w:t xml:space="preserve">instrumented so the confound in §6 can be ruled out rather than reasoned away.</w:t>
+        <w:t xml:space="preserve">instrumented so the confound in Section 6 can be ruled out rather than reasoned away.</w:t>
       </w:r>
     </w:p>
     <w:p>
@@ -2987,11 +4552,11 @@
       <w:pPr>
         <w:pStyle w:val="Heading2"/>
       </w:pPr>
-      <w:bookmarkStart w:id="31" w:name="conclusion"/>
+      <w:bookmarkStart w:id="35" w:name="conclusion"/>
       <w:r>
         <w:t xml:space="preserve">7. Conclusion</w:t>
       </w:r>
-      <w:bookmarkEnd w:id="31"/>
+      <w:bookmarkEnd w:id="35"/>
     </w:p>
     <w:p>
       <w:pPr>
@@ -3022,7 +4587,7 @@
         <w:t xml:space="preserve"> </w:t>
       </w:r>
       <w:r>
-        <w:t xml:space="preserve">(§2), the balancing-loop model (§4), and the shift-left coaching design (§5) all converge on</w:t>
+        <w:t xml:space="preserve">(Section 2), the balancing-loop model (Section 4), and the feedback-delay coaching design (Section 5) all converge on</w:t>
       </w:r>
       <w:r>
         <w:t xml:space="preserve"> </w:t>
@@ -3074,6 +4639,112 @@
       </w:r>
       <w:r>
         <w:t xml:space="preserve">game.</w:t>
+      </w:r>
+    </w:p>
+    <w:p>
+      <w:pPr>
+        <w:pStyle w:val="BodyText"/>
+      </w:pPr>
+      <w:r>
+        <w:t xml:space="preserve">The objection that AI makes all of this obsolete by making change cheap gets the economics</w:t>
+      </w:r>
+      <w:r>
+        <w:t xml:space="preserve"> </w:t>
+      </w:r>
+      <w:r>
+        <w:t xml:space="preserve">backwards. Cheap emission is exactly the condition under which Sloponomics bites: the cost of</w:t>
+      </w:r>
+      <w:r>
+        <w:t xml:space="preserve"> </w:t>
+      </w:r>
+      <w:r>
+        <w:t xml:space="preserve">quality does not vanish, it relocates downstream to churn, rework, and recordkeeping penalty,</w:t>
+      </w:r>
+      <w:r>
+        <w:t xml:space="preserve"> </w:t>
+      </w:r>
+      <w:r>
+        <w:t xml:space="preserve">and it lands on whoever owns the code rather than whoever emitted it. A read-only Antagonist</w:t>
+      </w:r>
+      <w:r>
+        <w:t xml:space="preserve"> </w:t>
+      </w:r>
+      <w:r>
+        <w:t xml:space="preserve">coaching at the point of authorship is the one instrument that moves that cost back to where it</w:t>
+      </w:r>
+      <w:r>
+        <w:t xml:space="preserve"> </w:t>
+      </w:r>
+      <w:r>
+        <w:t xml:space="preserve">is cheapest to pay, without ever holding the pen. The better the models get, the faster they</w:t>
+      </w:r>
+      <w:r>
+        <w:t xml:space="preserve"> </w:t>
+      </w:r>
+      <w:r>
+        <w:t xml:space="preserve">emit, and the more that instrument is worth. Capability is not the substitute for the referee.</w:t>
+      </w:r>
+      <w:r>
+        <w:t xml:space="preserve"> </w:t>
+      </w:r>
+      <w:r>
+        <w:t xml:space="preserve">Capability is the reason we finally need one.</w:t>
+      </w:r>
+    </w:p>
+    <w:p>
+      <w:pPr>
+        <w:pStyle w:val="BodyText"/>
+      </w:pPr>
+      <w:r>
+        <w:t xml:space="preserve">This leaves the argument anti-fragile to the one question no one can answer: whether the</w:t>
+      </w:r>
+      <w:r>
+        <w:t xml:space="preserve"> </w:t>
+      </w:r>
+      <w:r>
+        <w:t xml:space="preserve">frontier keeps climbing. If it does, the referee still holds — a faster Builder is a faster</w:t>
+      </w:r>
+      <w:r>
+        <w:t xml:space="preserve"> </w:t>
+      </w:r>
+      <w:r>
+        <w:t xml:space="preserve">source of slop, and the read-only standard is what keeps pace. If instead the escalator slows</w:t>
+      </w:r>
+      <w:r>
+        <w:t xml:space="preserve"> </w:t>
+      </w:r>
+      <w:r>
+        <w:t xml:space="preserve">against its physical ceiling — the wafers, the power, the water, and the memory prices already</w:t>
+      </w:r>
+      <w:r>
+        <w:t xml:space="preserve"> </w:t>
+      </w:r>
+      <w:r>
+        <w:t xml:space="preserve">bending under the weight of the buildout — then the capability that was supposed to rescue us</w:t>
+      </w:r>
+      <w:r>
+        <w:t xml:space="preserve"> </w:t>
+      </w:r>
+      <w:r>
+        <w:t xml:space="preserve">from context rot and slop is precisely what does not arrive, and a pattern deployable on today’s</w:t>
+      </w:r>
+      <w:r>
+        <w:t xml:space="preserve"> </w:t>
+      </w:r>
+      <w:r>
+        <w:t xml:space="preserve">models is the only thing left standing. The case for governing now wins in both futures. That is</w:t>
+      </w:r>
+      <w:r>
+        <w:t xml:space="preserve"> </w:t>
+      </w:r>
+      <w:r>
+        <w:t xml:space="preserve">the mark of a design that rests on a constraint rather than a forecast: it does not need to know</w:t>
+      </w:r>
+      <w:r>
+        <w:t xml:space="preserve"> </w:t>
+      </w:r>
+      <w:r>
+        <w:t xml:space="preserve">which way the frontier breaks.</w:t>
       </w:r>
     </w:p>
     <w:p>
@@ -3087,11 +4758,11 @@
       <w:pPr>
         <w:pStyle w:val="Heading2"/>
       </w:pPr>
-      <w:bookmarkStart w:id="32" w:name="references"/>
+      <w:bookmarkStart w:id="36" w:name="references"/>
       <w:r>
         <w:t xml:space="preserve">References</w:t>
       </w:r>
-      <w:bookmarkEnd w:id="32"/>
+      <w:bookmarkEnd w:id="36"/>
     </w:p>
     <w:p>
       <w:pPr>
@@ -3241,7 +4912,19 @@
         <w:rPr>
           <w:i/>
         </w:rPr>
-        <w:t xml:space="preserve">escalation across lifecycle phases; TRW/IBM defect data.)</w:t>
+        <w:t xml:space="preserve">escalation across lifecycle phases; TRW/IBM defect data. Cited here as the historical origin</w:t>
+      </w:r>
+      <w:r>
+        <w:rPr>
+          <w:i/>
+        </w:rPr>
+        <w:t xml:space="preserve"> </w:t>
+      </w:r>
+      <w:r>
+        <w:rPr>
+          <w:i/>
+        </w:rPr>
+        <w:t xml:space="preserve">of the curve, not as a governing coefficient — see Cohn and Section 5.)</w:t>
       </w:r>
     </w:p>
     <w:p>
@@ -3249,6 +4932,486 @@
         <w:pStyle w:val="BodyText"/>
       </w:pPr>
       <w:r>
+        <w:t xml:space="preserve">Chroma Research (2025).</w:t>
+      </w:r>
+      <w:r>
+        <w:t xml:space="preserve"> </w:t>
+      </w:r>
+      <w:r>
+        <w:rPr>
+          <w:i/>
+        </w:rPr>
+        <w:t xml:space="preserve">Context Rot: How Increasing Input Tokens Impacts LLM Performance.</w:t>
+      </w:r>
+      <w:r>
+        <w:t xml:space="preserve"> </w:t>
+      </w:r>
+      <w:r>
+        <w:rPr>
+          <w:i/>
+        </w:rPr>
+        <w:t xml:space="preserve">(Eighteen frontier models tested; all degrade as input length grows — including on simple</w:t>
+      </w:r>
+      <w:r>
+        <w:rPr>
+          <w:i/>
+        </w:rPr>
+        <w:t xml:space="preserve"> </w:t>
+      </w:r>
+      <w:r>
+        <w:rPr>
+          <w:i/>
+        </w:rPr>
+        <w:t xml:space="preserve">retrieval — with significant degradation possible around 50K tokens in a 200K-token window.</w:t>
+      </w:r>
+      <w:r>
+        <w:rPr>
+          <w:i/>
+        </w:rPr>
+        <w:t xml:space="preserve"> </w:t>
+      </w:r>
+      <w:r>
+        <w:rPr>
+          <w:i/>
+        </w:rPr>
+        <w:t xml:space="preserve">Basis for Figure 2 and the</w:t>
+      </w:r>
+      <w:r>
+        <w:rPr>
+          <w:i/>
+        </w:rPr>
+        <w:t xml:space="preserve"> </w:t>
+      </w:r>
+      <w:r>
+        <w:rPr>
+          <w:i/>
+        </w:rPr>
+        <w:t xml:space="preserve">“</w:t>
+      </w:r>
+      <w:r>
+        <w:rPr>
+          <w:i/>
+        </w:rPr>
+        <w:t xml:space="preserve">separation of context</w:t>
+      </w:r>
+      <w:r>
+        <w:rPr>
+          <w:i/>
+        </w:rPr>
+        <w:t xml:space="preserve">”</w:t>
+      </w:r>
+      <w:r>
+        <w:rPr>
+          <w:i/>
+        </w:rPr>
+        <w:t xml:space="preserve"> </w:t>
+      </w:r>
+      <w:r>
+        <w:rPr>
+          <w:i/>
+        </w:rPr>
+        <w:t xml:space="preserve">argument in Section 4.1.)</w:t>
+      </w:r>
+    </w:p>
+    <w:p>
+      <w:pPr>
+        <w:pStyle w:val="BodyText"/>
+      </w:pPr>
+      <w:r>
+        <w:t xml:space="preserve">Cohn, M. (2026).</w:t>
+      </w:r>
+      <w:r>
+        <w:t xml:space="preserve"> </w:t>
+      </w:r>
+      <w:r>
+        <w:t xml:space="preserve">“</w:t>
+      </w:r>
+      <w:r>
+        <w:t xml:space="preserve">The Cost of Change Curve Is Outdated.</w:t>
+      </w:r>
+      <w:r>
+        <w:t xml:space="preserve">”</w:t>
+      </w:r>
+      <w:r>
+        <w:t xml:space="preserve"> </w:t>
+      </w:r>
+      <w:r>
+        <w:t xml:space="preserve">Mountain Goat Software.</w:t>
+      </w:r>
+      <w:r>
+        <w:t xml:space="preserve"> </w:t>
+      </w:r>
+      <w:r>
+        <w:rPr>
+          <w:i/>
+        </w:rPr>
+        <w:t xml:space="preserve">(The curve flattened with IDEs, CI, modular architecture, and agile; the residual cost of</w:t>
+      </w:r>
+      <w:r>
+        <w:rPr>
+          <w:i/>
+        </w:rPr>
+        <w:t xml:space="preserve"> </w:t>
+      </w:r>
+      <w:r>
+        <w:rPr>
+          <w:i/>
+        </w:rPr>
+        <w:t xml:space="preserve">change is feedback delay, not development effort;</w:t>
+      </w:r>
+      <w:r>
+        <w:rPr>
+          <w:i/>
+        </w:rPr>
+        <w:t xml:space="preserve"> </w:t>
+      </w:r>
+      <w:r>
+        <w:rPr>
+          <w:i/>
+        </w:rPr>
+        <w:t xml:space="preserve">“</w:t>
+      </w:r>
+      <w:r>
+        <w:rPr>
+          <w:i/>
+        </w:rPr>
+        <w:t xml:space="preserve">the biggest risk is waiting too long to</w:t>
+      </w:r>
+      <w:r>
+        <w:rPr>
+          <w:i/>
+        </w:rPr>
+        <w:t xml:space="preserve"> </w:t>
+      </w:r>
+      <w:r>
+        <w:rPr>
+          <w:i/>
+        </w:rPr>
+        <w:t xml:space="preserve">learn.</w:t>
+      </w:r>
+      <w:r>
+        <w:rPr>
+          <w:i/>
+        </w:rPr>
+        <w:t xml:space="preserve">”</w:t>
+      </w:r>
+      <w:r>
+        <w:rPr>
+          <w:i/>
+        </w:rPr>
+        <w:t xml:space="preserve"> </w:t>
+      </w:r>
+      <w:r>
+        <w:rPr>
+          <w:i/>
+        </w:rPr>
+        <w:t xml:space="preserve">Section 5 adopts this position but contests one claim — that AI flattens the curve further.)</w:t>
+      </w:r>
+    </w:p>
+    <w:p>
+      <w:pPr>
+        <w:pStyle w:val="BodyText"/>
+      </w:pPr>
+      <w:r>
+        <w:t xml:space="preserve">GitClear (2024–2025).</w:t>
+      </w:r>
+      <w:r>
+        <w:t xml:space="preserve"> </w:t>
+      </w:r>
+      <w:r>
+        <w:rPr>
+          <w:i/>
+        </w:rPr>
+        <w:t xml:space="preserve">Coding on Copilot: Data Shows AI’s Downward Pressure on Code Quality</w:t>
+      </w:r>
+      <w:r>
+        <w:t xml:space="preserve">;</w:t>
+      </w:r>
+      <w:r>
+        <w:t xml:space="preserve"> </w:t>
+      </w:r>
+      <w:r>
+        <w:rPr>
+          <w:i/>
+        </w:rPr>
+        <w:t xml:space="preserve">AI Copilot Code Quality</w:t>
+      </w:r>
+      <w:r>
+        <w:t xml:space="preserve"> </w:t>
+      </w:r>
+      <w:r>
+        <w:t xml:space="preserve">(updates).</w:t>
+      </w:r>
+      <w:r>
+        <w:t xml:space="preserve"> </w:t>
+      </w:r>
+      <w:r>
+        <w:rPr>
+          <w:i/>
+        </w:rPr>
+        <w:t xml:space="preserve">(Across 211M+ changed lines: churn roughly doubling with</w:t>
+      </w:r>
+      <w:r>
+        <w:rPr>
+          <w:i/>
+        </w:rPr>
+        <w:t xml:space="preserve"> </w:t>
+      </w:r>
+      <w:r>
+        <w:rPr>
+          <w:i/>
+        </w:rPr>
+        <w:t xml:space="preserve">AI adoption, refactoring’s share collapsing, cloned/copy-pasted code rising above moved code —</w:t>
+      </w:r>
+      <w:r>
+        <w:rPr>
+          <w:i/>
+        </w:rPr>
+        <w:t xml:space="preserve"> </w:t>
+      </w:r>
+      <w:r>
+        <w:rPr>
+          <w:i/>
+        </w:rPr>
+        <w:t xml:space="preserve">the empirical shape of AI raising the cost of owning code even as it lowers the cost of emitting</w:t>
+      </w:r>
+      <w:r>
+        <w:rPr>
+          <w:i/>
+        </w:rPr>
+        <w:t xml:space="preserve"> </w:t>
+      </w:r>
+      <w:r>
+        <w:rPr>
+          <w:i/>
+        </w:rPr>
+        <w:t xml:space="preserve">it.)</w:t>
+      </w:r>
+    </w:p>
+    <w:p>
+      <w:pPr>
+        <w:pStyle w:val="BodyText"/>
+      </w:pPr>
+      <w:r>
+        <w:t xml:space="preserve">SEC (2024).</w:t>
+      </w:r>
+      <w:r>
+        <w:t xml:space="preserve"> </w:t>
+      </w:r>
+      <w:r>
+        <w:rPr>
+          <w:i/>
+        </w:rPr>
+        <w:t xml:space="preserve">Twenty-Six Firms to Pay More Than $390 Million… for Widespread Recordkeeping</w:t>
+      </w:r>
+      <w:r>
+        <w:rPr>
+          <w:i/>
+        </w:rPr>
+        <w:t xml:space="preserve"> </w:t>
+      </w:r>
+      <w:r>
+        <w:rPr>
+          <w:i/>
+        </w:rPr>
+        <w:t xml:space="preserve">Failures</w:t>
+      </w:r>
+      <w:r>
+        <w:t xml:space="preserve"> </w:t>
+      </w:r>
+      <w:r>
+        <w:t xml:space="preserve">($392.75M);</w:t>
+      </w:r>
+      <w:r>
+        <w:t xml:space="preserve"> </w:t>
+      </w:r>
+      <w:r>
+        <w:rPr>
+          <w:i/>
+        </w:rPr>
+        <w:t xml:space="preserve">Eleven Firms to Pay More Than $88 Million…</w:t>
+      </w:r>
+      <w:r>
+        <w:t xml:space="preserve">; and FINRA recordkeeping</w:t>
+      </w:r>
+      <w:r>
+        <w:t xml:space="preserve"> </w:t>
+      </w:r>
+      <w:r>
+        <w:t xml:space="preserve">enforcement (e.g. BTIG, $600K).</w:t>
+      </w:r>
+      <w:r>
+        <w:t xml:space="preserve"> </w:t>
+      </w:r>
+      <w:r>
+        <w:rPr>
+          <w:i/>
+        </w:rPr>
+        <w:t xml:space="preserve">(The price of ungoverned, unretained output in a regulated</w:t>
+      </w:r>
+      <w:r>
+        <w:rPr>
+          <w:i/>
+        </w:rPr>
+        <w:t xml:space="preserve"> </w:t>
+      </w:r>
+      <w:r>
+        <w:rPr>
+          <w:i/>
+        </w:rPr>
+        <w:t xml:space="preserve">domain — the steep end of the cost curve the platform is built to serve.)</w:t>
+      </w:r>
+    </w:p>
+    <w:p>
+      <w:pPr>
+        <w:pStyle w:val="BodyText"/>
+      </w:pPr>
+      <w:r>
+        <w:t xml:space="preserve">Project Management Institute — Disciplined Agile (2022).</w:t>
+      </w:r>
+      <w:r>
+        <w:t xml:space="preserve"> </w:t>
+      </w:r>
+      <w:r>
+        <w:t xml:space="preserve">“</w:t>
+      </w:r>
+      <w:r>
+        <w:t xml:space="preserve">Cost of Change on Software Teams.</w:t>
+      </w:r>
+      <w:r>
+        <w:t xml:space="preserve">”</w:t>
+      </w:r>
+      <w:r>
+        <w:t xml:space="preserve"> </w:t>
+      </w:r>
+      <w:r>
+        <w:rPr>
+          <w:i/>
+        </w:rPr>
+        <w:t xml:space="preserve">(Escalation holds for agile teams too; shorter release cadence and feedback cycles lower the</w:t>
+      </w:r>
+      <w:r>
+        <w:rPr>
+          <w:i/>
+        </w:rPr>
+        <w:t xml:space="preserve"> </w:t>
+      </w:r>
+      <w:r>
+        <w:rPr>
+          <w:i/>
+        </w:rPr>
+        <w:t xml:space="preserve">average cost of change — the reconciling lever.)</w:t>
+      </w:r>
+    </w:p>
+    <w:p>
+      <w:pPr>
+        <w:pStyle w:val="BodyText"/>
+      </w:pPr>
+      <w:r>
+        <w:t xml:space="preserve">Feathers, M. (2004).</w:t>
+      </w:r>
+      <w:r>
+        <w:t xml:space="preserve"> </w:t>
+      </w:r>
+      <w:r>
+        <w:rPr>
+          <w:i/>
+        </w:rPr>
+        <w:t xml:space="preserve">Working Effectively with Legacy Code.</w:t>
+      </w:r>
+      <w:r>
+        <w:t xml:space="preserve"> </w:t>
+      </w:r>
+      <w:r>
+        <w:t xml:space="preserve">Prentice Hall.</w:t>
+      </w:r>
+      <w:r>
+        <w:t xml:space="preserve"> </w:t>
+      </w:r>
+      <w:r>
+        <w:rPr>
+          <w:i/>
+        </w:rPr>
+        <w:t xml:space="preserve">(Seams and</w:t>
+      </w:r>
+      <w:r>
+        <w:rPr>
+          <w:i/>
+        </w:rPr>
+        <w:t xml:space="preserve"> </w:t>
+      </w:r>
+      <w:r>
+        <w:rPr>
+          <w:i/>
+        </w:rPr>
+        <w:t xml:space="preserve">characterization tests: you make existing code safe to change before you change it — the</w:t>
+      </w:r>
+      <w:r>
+        <w:rPr>
+          <w:i/>
+        </w:rPr>
+        <w:t xml:space="preserve"> </w:t>
+      </w:r>
+      <w:r>
+        <w:rPr>
+          <w:i/>
+        </w:rPr>
+        <w:t xml:space="preserve">discipline the</w:t>
+      </w:r>
+      <w:r>
+        <w:rPr>
+          <w:i/>
+        </w:rPr>
+        <w:t xml:space="preserve"> </w:t>
+      </w:r>
+      <w:r>
+        <w:rPr>
+          <w:i/>
+        </w:rPr>
+        <w:t xml:space="preserve">“</w:t>
+      </w:r>
+      <w:r>
+        <w:rPr>
+          <w:i/>
+        </w:rPr>
+        <w:t xml:space="preserve">duct tape</w:t>
+      </w:r>
+      <w:r>
+        <w:rPr>
+          <w:i/>
+        </w:rPr>
+        <w:t xml:space="preserve">”</w:t>
+      </w:r>
+      <w:r>
+        <w:rPr>
+          <w:i/>
+        </w:rPr>
+        <w:t xml:space="preserve"> </w:t>
+      </w:r>
+      <w:r>
+        <w:rPr>
+          <w:i/>
+        </w:rPr>
+        <w:t xml:space="preserve">state demands, and the reason the Antagonist pattern must extend to</w:t>
+      </w:r>
+      <w:r>
+        <w:rPr>
+          <w:i/>
+        </w:rPr>
+        <w:t xml:space="preserve"> </w:t>
+      </w:r>
+      <w:r>
+        <w:rPr>
+          <w:i/>
+        </w:rPr>
+        <w:t xml:space="preserve">existing codebases, not only newly-generated ones.)</w:t>
+      </w:r>
+    </w:p>
+    <w:p>
+      <w:pPr>
+        <w:pStyle w:val="BodyText"/>
+      </w:pPr>
+      <w:r>
         <w:t xml:space="preserve">Forrester, J. W. (1961).</w:t>
       </w:r>
       <w:r>
@@ -3503,6 +5666,68 @@
           <w:i/>
         </w:rPr>
         <w:t xml:space="preserve">(Reinforcing vs. balancing loops as the grammar of systems thinking.)</w:t>
+      </w:r>
+    </w:p>
+    <w:p>
+      <w:pPr>
+        <w:pStyle w:val="BodyText"/>
+      </w:pPr>
+      <w:r>
+        <w:t xml:space="preserve">Stecklein, J. M., et al. (2004).</w:t>
+      </w:r>
+      <w:r>
+        <w:t xml:space="preserve"> </w:t>
+      </w:r>
+      <w:r>
+        <w:rPr>
+          <w:i/>
+        </w:rPr>
+        <w:t xml:space="preserve">Error Cost Escalation Through the Project Life Cycle.</w:t>
+      </w:r>
+      <w:r>
+        <w:t xml:space="preserve"> </w:t>
+      </w:r>
+      <w:r>
+        <w:t xml:space="preserve">NASA</w:t>
+      </w:r>
+      <w:r>
+        <w:t xml:space="preserve"> </w:t>
+      </w:r>
+      <w:r>
+        <w:t xml:space="preserve">Johnson Space Center.</w:t>
+      </w:r>
+      <w:r>
+        <w:t xml:space="preserve"> </w:t>
+      </w:r>
+      <w:r>
+        <w:rPr>
+          <w:i/>
+        </w:rPr>
+        <w:t xml:space="preserve">(Requirements error: 1 unit at requirements → 29–1500+ units at</w:t>
+      </w:r>
+      <w:r>
+        <w:rPr>
+          <w:i/>
+        </w:rPr>
+        <w:t xml:space="preserve"> </w:t>
+      </w:r>
+      <w:r>
+        <w:rPr>
+          <w:i/>
+        </w:rPr>
+        <w:t xml:space="preserve">operations, for spacecraft/military-grade systems — escalation is steepest in safety-critical</w:t>
+      </w:r>
+      <w:r>
+        <w:rPr>
+          <w:i/>
+        </w:rPr>
+        <w:t xml:space="preserve"> </w:t>
+      </w:r>
+      <w:r>
+        <w:rPr>
+          <w:i/>
+        </w:rPr>
+        <w:t xml:space="preserve">integration, the domain regulated enterprises most resemble.)</w:t>
       </w:r>
     </w:p>
     <w:p>
@@ -3622,7 +5847,7 @@
       </w:r>
     </w:p>
   </w:footnote>
-  <w:footnote w:id="29">
+  <w:footnote w:id="31">
     <w:p>
       <w:pPr>
         <w:pStyle w:val="FootnoteText"/>
@@ -3637,49 +5862,363 @@
         <w:t xml:space="preserve"> </w:t>
       </w:r>
       <w:r>
-        <w:t xml:space="preserve">The exact multipliers are contested; later empirical work (e.g. Menzies et al.,</w:t>
-      </w:r>
-      <w:r>
-        <w:t xml:space="preserve"> </w:t>
-      </w:r>
-      <w:r>
-        <w:rPr>
-          <w:i/>
-        </w:rPr>
+        <w:t xml:space="preserve">The picture across the sources is not a contradiction but a domain split, and</w:t>
+      </w:r>
+      <w:r>
+        <w:t xml:space="preserve"> </w:t>
+      </w:r>
+      <w:r>
+        <w:t xml:space="preserve">it is worth stating honestly. In safety-critical systems integration, escalation is still</w:t>
+      </w:r>
+      <w:r>
+        <w:t xml:space="preserve"> </w:t>
+      </w:r>
+      <w:r>
+        <w:t xml:space="preserve">brutal: a NASA study (Stecklein et al.,</w:t>
+      </w:r>
+      <w:r>
+        <w:t xml:space="preserve"> </w:t>
+      </w:r>
+      <w:r>
+        <w:rPr>
+          <w:i/>
+        </w:rPr>
+        <w:t xml:space="preserve">Error Cost Escalation Through the Project Life</w:t>
+      </w:r>
+      <w:r>
+        <w:rPr>
+          <w:i/>
+        </w:rPr>
+        <w:t xml:space="preserve"> </w:t>
+      </w:r>
+      <w:r>
+        <w:rPr>
+          <w:i/>
+        </w:rPr>
+        <w:t xml:space="preserve">Cycle</w:t>
+      </w:r>
+      <w:r>
+        <w:t xml:space="preserve">) puts a requirements error at 1 unit in the requirements phase rising to 29–1500+ units</w:t>
+      </w:r>
+      <w:r>
+        <w:t xml:space="preserve"> </w:t>
+      </w:r>
+      <w:r>
+        <w:t xml:space="preserve">in operations. In modern application software, Cohn (</w:t>
+      </w:r>
+      <w:r>
+        <w:rPr>
+          <w:i/>
+        </w:rPr>
+        <w:t xml:space="preserve">The Cost of Change Curve Is Outdated</w:t>
+      </w:r>
+      <w:r>
+        <w:t xml:space="preserve">)</w:t>
+      </w:r>
+      <w:r>
+        <w:t xml:space="preserve"> </w:t>
+      </w:r>
+      <w:r>
+        <w:t xml:space="preserve">argues the curve is</w:t>
+      </w:r>
+      <w:r>
+        <w:t xml:space="preserve"> </w:t>
+      </w:r>
+      <w:r>
         <w:t xml:space="preserve">“</w:t>
       </w:r>
       <w:r>
-        <w:rPr>
-          <w:i/>
-        </w:rPr>
-        <w:t xml:space="preserve">Are Delayed Issues Harder to Resolve?</w:t>
-      </w:r>
-      <w:r>
-        <w:rPr>
-          <w:i/>
-        </w:rPr>
+        <w:t xml:space="preserve">dramatically flatter.</w:t>
+      </w:r>
+      <w:r>
         <w:t xml:space="preserve">”</w:t>
       </w:r>
       <w:r>
-        <w:t xml:space="preserve">, revisiting NASA and open-source data) finds the</w:t>
-      </w:r>
-      <w:r>
-        <w:t xml:space="preserve"> </w:t>
-      </w:r>
-      <w:r>
-        <w:t xml:space="preserve">escalation real but often gentler and highly context-dependent than Boehm’s original curve.</w:t>
-      </w:r>
-      <w:r>
-        <w:t xml:space="preserve"> </w:t>
-      </w:r>
-      <w:r>
-        <w:t xml:space="preserve">The paper relies only on the robust, uncontested direction of the effect — later is dearer —</w:t>
-      </w:r>
-      <w:r>
-        <w:t xml:space="preserve"> </w:t>
-      </w:r>
-      <w:r>
-        <w:t xml:space="preserve">not on any specific coefficient.</w:t>
+        <w:t xml:space="preserve"> </w:t>
+      </w:r>
+      <w:r>
+        <w:t xml:space="preserve">The Project Management Institute’s Disciplined</w:t>
+      </w:r>
+      <w:r>
+        <w:t xml:space="preserve"> </w:t>
+      </w:r>
+      <w:r>
+        <w:t xml:space="preserve">Agile material reconciles the two: escalation is real, but the lever that flattens it is</w:t>
+      </w:r>
+      <w:r>
+        <w:t xml:space="preserve"> </w:t>
+      </w:r>
+      <w:r>
+        <w:rPr>
+          <w:b/>
+        </w:rPr>
+        <w:t xml:space="preserve">release cadence and feedback-cycle length</w:t>
+      </w:r>
+      <w:r>
+        <w:t xml:space="preserve"> </w:t>
+      </w:r>
+      <w:r>
+        <w:t xml:space="preserve">— the more often you close the loop, the lower</w:t>
+      </w:r>
+      <w:r>
+        <w:t xml:space="preserve"> </w:t>
+      </w:r>
+      <w:r>
+        <w:t xml:space="preserve">the average cost of change. The invariant beneath the disagreement is not a coefficient; it is</w:t>
+      </w:r>
+      <w:r>
+        <w:t xml:space="preserve"> </w:t>
+      </w:r>
+      <w:r>
+        <w:t xml:space="preserve">that</w:t>
+      </w:r>
+      <w:r>
+        <w:t xml:space="preserve"> </w:t>
+      </w:r>
+      <w:r>
+        <w:rPr>
+          <w:i/>
+        </w:rPr>
+        <w:t xml:space="preserve">feedback delay is the cost.</w:t>
+      </w:r>
+      <w:r>
+        <w:t xml:space="preserve"> </w:t>
+      </w:r>
+      <w:r>
+        <w:t xml:space="preserve">This paper relies only on that invariant. (It also notes</w:t>
+      </w:r>
+      <w:r>
+        <w:t xml:space="preserve"> </w:t>
+      </w:r>
+      <w:r>
+        <w:t xml:space="preserve">that the platform’s target — regulated enterprises — sits closer to the NASA end of the split</w:t>
+      </w:r>
+      <w:r>
+        <w:t xml:space="preserve"> </w:t>
+      </w:r>
+      <w:r>
+        <w:t xml:space="preserve">than the web-app end, which makes early feedback worth more, not less, in exactly the market</w:t>
+      </w:r>
+      <w:r>
+        <w:t xml:space="preserve"> </w:t>
+      </w:r>
+      <w:r>
+        <w:t xml:space="preserve">that matters here.)</w:t>
+      </w:r>
+    </w:p>
+  </w:footnote>
+  <w:footnote w:id="32">
+    <w:p>
+      <w:pPr>
+        <w:pStyle w:val="FootnoteText"/>
+      </w:pPr>
+      <w:r>
+        <w:rPr>
+          <w:rStyle w:val="FootnoteReference"/>
+        </w:rPr>
+        <w:footnoteRef/>
+      </w:r>
+      <w:r>
+        <w:t xml:space="preserve"> </w:t>
+      </w:r>
+      <w:r>
+        <w:t xml:space="preserve">GitClear,</w:t>
+      </w:r>
+      <w:r>
+        <w:t xml:space="preserve"> </w:t>
+      </w:r>
+      <w:r>
+        <w:rPr>
+          <w:i/>
+        </w:rPr>
+        <w:t xml:space="preserve">Coding on Copilot: 2023 Data Shows AI’s Downward Pressure on Code Quality</w:t>
+      </w:r>
+      <w:r>
+        <w:t xml:space="preserve"> </w:t>
+      </w:r>
+      <w:r>
+        <w:t xml:space="preserve">(with 2024–2025 updates,</w:t>
+      </w:r>
+      <w:r>
+        <w:t xml:space="preserve"> </w:t>
+      </w:r>
+      <w:r>
+        <w:rPr>
+          <w:i/>
+        </w:rPr>
+        <w:t xml:space="preserve">AI Copilot Code Quality</w:t>
+      </w:r>
+      <w:r>
+        <w:t xml:space="preserve">). The metrics — churn,</w:t>
+      </w:r>
+      <w:r>
+        <w:t xml:space="preserve"> </w:t>
+      </w:r>
+      <w:r>
+        <w:t xml:space="preserve">“</w:t>
+      </w:r>
+      <w:r>
+        <w:t xml:space="preserve">moved</w:t>
+      </w:r>
+      <w:r>
+        <w:t xml:space="preserve">”</w:t>
+      </w:r>
+      <w:r>
+        <w:t xml:space="preserve"> </w:t>
+      </w:r>
+      <w:r>
+        <w:t xml:space="preserve">vs.</w:t>
+      </w:r>
+      <w:r>
+        <w:t xml:space="preserve"> </w:t>
+      </w:r>
+      <w:r>
+        <w:t xml:space="preserve">“</w:t>
+      </w:r>
+      <w:r>
+        <w:t xml:space="preserve">copy/pasted</w:t>
+      </w:r>
+      <w:r>
+        <w:t xml:space="preserve">”</w:t>
+      </w:r>
+      <w:r>
+        <w:t xml:space="preserve"> </w:t>
+      </w:r>
+      <w:r>
+        <w:t xml:space="preserve">line classification, refactoring share — are GitClear’s own definitions over a</w:t>
+      </w:r>
+      <w:r>
+        <w:t xml:space="preserve"> </w:t>
+      </w:r>
+      <w:r>
+        <w:t xml:space="preserve">large commit corpus; they establish direction and magnitude, not a controlled causal proof, and</w:t>
+      </w:r>
+      <w:r>
+        <w:t xml:space="preserve"> </w:t>
+      </w:r>
+      <w:r>
+        <w:t xml:space="preserve">are reported here as the current best evidence that AI assistance correlates with</w:t>
+      </w:r>
+      <w:r>
+        <w:t xml:space="preserve"> </w:t>
+      </w:r>
+      <w:r>
+        <w:rPr>
+          <w:i/>
+        </w:rPr>
+        <w:t xml:space="preserve">more</w:t>
+      </w:r>
+      <w:r>
+        <w:t xml:space="preserve"> </w:t>
+      </w:r>
+      <w:r>
+        <w:t xml:space="preserve">rework,</w:t>
+      </w:r>
+      <w:r>
+        <w:t xml:space="preserve"> </w:t>
+      </w:r>
+      <w:r>
+        <w:t xml:space="preserve">not less. Cited to contest one claim (that AI flattens the curve), not to indict AI-assisted</w:t>
+      </w:r>
+      <w:r>
+        <w:t xml:space="preserve"> </w:t>
+      </w:r>
+      <w:r>
+        <w:t xml:space="preserve">development as such.</w:t>
+      </w:r>
+    </w:p>
+  </w:footnote>
+  <w:footnote w:id="33">
+    <w:p>
+      <w:pPr>
+        <w:pStyle w:val="FootnoteText"/>
+      </w:pPr>
+      <w:r>
+        <w:rPr>
+          <w:rStyle w:val="FootnoteReference"/>
+        </w:rPr>
+        <w:footnoteRef/>
+      </w:r>
+      <w:r>
+        <w:t xml:space="preserve"> </w:t>
+      </w:r>
+      <w:r>
+        <w:t xml:space="preserve">SEC,</w:t>
+      </w:r>
+      <w:r>
+        <w:t xml:space="preserve"> </w:t>
+      </w:r>
+      <w:r>
+        <w:rPr>
+          <w:i/>
+        </w:rPr>
+        <w:t xml:space="preserve">Twenty-Six Firms to Pay More Than $390 Million… for Widespread Recordkeeping</w:t>
+      </w:r>
+      <w:r>
+        <w:rPr>
+          <w:i/>
+        </w:rPr>
+        <w:t xml:space="preserve"> </w:t>
+      </w:r>
+      <w:r>
+        <w:rPr>
+          <w:i/>
+        </w:rPr>
+        <w:t xml:space="preserve">Failures</w:t>
+      </w:r>
+      <w:r>
+        <w:t xml:space="preserve"> </w:t>
+      </w:r>
+      <w:r>
+        <w:t xml:space="preserve">(2024, $392.75M) and</w:t>
+      </w:r>
+      <w:r>
+        <w:t xml:space="preserve"> </w:t>
+      </w:r>
+      <w:r>
+        <w:rPr>
+          <w:i/>
+        </w:rPr>
+        <w:t xml:space="preserve">Eleven Firms to Pay More Than $88 Million…</w:t>
+      </w:r>
+      <w:r>
+        <w:t xml:space="preserve"> </w:t>
+      </w:r>
+      <w:r>
+        <w:t xml:space="preserve">(2024); FINRA</w:t>
+      </w:r>
+      <w:r>
+        <w:t xml:space="preserve"> </w:t>
+      </w:r>
+      <w:r>
+        <w:t xml:space="preserve">enforcement, e.g. BTIG ($600,000, 2024). These are recordkeeping/off-channel-communication</w:t>
+      </w:r>
+      <w:r>
+        <w:t xml:space="preserve"> </w:t>
+      </w:r>
+      <w:r>
+        <w:t xml:space="preserve">penalties, not code-quality penalties — cited as evidence that in regulated domains the cost of</w:t>
+      </w:r>
+      <w:r>
+        <w:t xml:space="preserve"> </w:t>
+      </w:r>
+      <w:r>
+        <w:rPr>
+          <w:i/>
+        </w:rPr>
+        <w:t xml:space="preserve">ungoverned, unretained, unprovable output</w:t>
+      </w:r>
+      <w:r>
+        <w:t xml:space="preserve"> </w:t>
+      </w:r>
+      <w:r>
+        <w:t xml:space="preserve">is large and real, which is the general class the</w:t>
+      </w:r>
+      <w:r>
+        <w:t xml:space="preserve"> </w:t>
+      </w:r>
+      <w:r>
+        <w:t xml:space="preserve">Antagonist’s audit trail and read-only standard exist to address.</w:t>
       </w:r>
     </w:p>
   </w:footnote>

</xml_diff>